<commit_message>
Proof reads of workshops 1-5. Created study notes for 1-5.
</commit_message>
<xml_diff>
--- a/Workshops/Workshop 1 - Hidden assumptions/Workshop-1---Gettin-back-into-R.docx
+++ b/Workshops/Workshop 1 - Hidden assumptions/Workshop-1---Gettin-back-into-R.docx
@@ -77,7 +77,7 @@
         <w:t xml:space="preserve"> </w:t>
       </w:r>
       <w:r>
-        <w:t xml:space="preserve">2025-08-21</w:t>
+        <w:t xml:space="preserve">2025-08-24</w:t>
       </w:r>
     </w:p>
     <w:sdt>
@@ -127,8 +127,8 @@
       </w:r>
       <w:r>
         <w:rPr>
+          <w:iCs/>
           <w:i/>
-          <w:iCs/>
         </w:rPr>
         <w:t xml:space="preserve">should</w:t>
       </w:r>
@@ -146,11 +146,11 @@
     </w:p>
     <w:p>
       <w:pPr>
-        <w:pStyle w:val="Compact"/>
         <w:numPr>
           <w:ilvl w:val="0"/>
           <w:numId w:val="1001"/>
         </w:numPr>
+        <w:pStyle w:val="Compact"/>
       </w:pPr>
       <w:r>
         <w:t xml:space="preserve">Formulate a research question.</w:t>
@@ -158,11 +158,11 @@
     </w:p>
     <w:p>
       <w:pPr>
-        <w:pStyle w:val="Compact"/>
         <w:numPr>
           <w:ilvl w:val="0"/>
           <w:numId w:val="1001"/>
         </w:numPr>
+        <w:pStyle w:val="Compact"/>
       </w:pPr>
       <w:r>
         <w:t xml:space="preserve">Perform exploratory data analysis [Focus of today].</w:t>
@@ -170,11 +170,11 @@
     </w:p>
     <w:p>
       <w:pPr>
-        <w:pStyle w:val="Compact"/>
         <w:numPr>
           <w:ilvl w:val="0"/>
           <w:numId w:val="1001"/>
         </w:numPr>
+        <w:pStyle w:val="Compact"/>
       </w:pPr>
       <w:r>
         <w:t xml:space="preserve">Identify any hidden assumptions.</w:t>
@@ -182,11 +182,11 @@
     </w:p>
     <w:p>
       <w:pPr>
-        <w:pStyle w:val="Compact"/>
         <w:numPr>
           <w:ilvl w:val="0"/>
           <w:numId w:val="1001"/>
         </w:numPr>
+        <w:pStyle w:val="Compact"/>
       </w:pPr>
       <w:r>
         <w:t xml:space="preserve">Fit an appropriate model.</w:t>
@@ -194,11 +194,11 @@
     </w:p>
     <w:p>
       <w:pPr>
-        <w:pStyle w:val="Compact"/>
         <w:numPr>
           <w:ilvl w:val="0"/>
           <w:numId w:val="1001"/>
         </w:numPr>
+        <w:pStyle w:val="Compact"/>
       </w:pPr>
       <w:r>
         <w:t xml:space="preserve">Diagnose the model and check assumptions.</w:t>
@@ -206,11 +206,11 @@
     </w:p>
     <w:p>
       <w:pPr>
-        <w:pStyle w:val="Compact"/>
         <w:numPr>
           <w:ilvl w:val="0"/>
           <w:numId w:val="1001"/>
         </w:numPr>
+        <w:pStyle w:val="Compact"/>
       </w:pPr>
       <w:r>
         <w:t xml:space="preserve">Summarise the results.</w:t>
@@ -218,11 +218,11 @@
     </w:p>
     <w:p>
       <w:pPr>
-        <w:pStyle w:val="Compact"/>
         <w:numPr>
           <w:ilvl w:val="0"/>
           <w:numId w:val="1001"/>
         </w:numPr>
+        <w:pStyle w:val="Compact"/>
       </w:pPr>
       <w:r>
         <w:t xml:space="preserve">Interpret and provide inferences.</w:t>
@@ -248,11 +248,11 @@
     </w:p>
     <w:p>
       <w:pPr>
-        <w:pStyle w:val="Compact"/>
         <w:numPr>
           <w:ilvl w:val="0"/>
           <w:numId w:val="1002"/>
         </w:numPr>
+        <w:pStyle w:val="Compact"/>
       </w:pPr>
       <w:r>
         <w:t xml:space="preserve">(Re)familiarise yourself with the basics of</w:t>
@@ -272,11 +272,11 @@
     </w:p>
     <w:p>
       <w:pPr>
-        <w:pStyle w:val="Compact"/>
         <w:numPr>
           <w:ilvl w:val="0"/>
           <w:numId w:val="1002"/>
         </w:numPr>
+        <w:pStyle w:val="Compact"/>
       </w:pPr>
       <w:r>
         <w:t xml:space="preserve">Use</w:t>
@@ -299,11 +299,11 @@
     </w:p>
     <w:p>
       <w:pPr>
-        <w:pStyle w:val="Compact"/>
         <w:numPr>
           <w:ilvl w:val="0"/>
           <w:numId w:val="1002"/>
         </w:numPr>
+        <w:pStyle w:val="Compact"/>
       </w:pPr>
       <w:r>
         <w:t xml:space="preserve">Use the results of the EDA (Exploratory Data Analysis) to identify any issues in the data;</w:t>
@@ -311,11 +311,11 @@
     </w:p>
     <w:p>
       <w:pPr>
-        <w:pStyle w:val="Compact"/>
         <w:numPr>
           <w:ilvl w:val="0"/>
           <w:numId w:val="1002"/>
         </w:numPr>
+        <w:pStyle w:val="Compact"/>
       </w:pPr>
       <w:r>
         <w:t xml:space="preserve">Begin thinking about the assumptions we make with a specific dataset even before we begin using statistics</w:t>
@@ -333,8 +333,8 @@
       </w:r>
       <w:r>
         <w:rPr>
+          <w:bCs/>
           <w:b/>
-          <w:bCs/>
         </w:rPr>
         <w:t xml:space="preserve">initial, quick explorations</w:t>
       </w:r>
@@ -1053,24 +1053,24 @@
       </w:r>
       <w:r>
         <w:rPr>
+          <w:iCs/>
           <w:i/>
+        </w:rPr>
+        <w:t xml:space="preserve">you</w:t>
+      </w:r>
+      <w:r>
+        <w:t xml:space="preserve"> </w:t>
+      </w:r>
+      <w:r>
+        <w:t xml:space="preserve">trying to do, and not, what does</w:t>
+      </w:r>
+      <w:r>
+        <w:t xml:space="preserve"> </w:t>
+      </w:r>
+      <w:r>
+        <w:rPr>
           <w:iCs/>
-        </w:rPr>
-        <w:t xml:space="preserve">you</w:t>
-      </w:r>
-      <w:r>
-        <w:t xml:space="preserve"> </w:t>
-      </w:r>
-      <w:r>
-        <w:t xml:space="preserve">trying to do, and not, what does</w:t>
-      </w:r>
-      <w:r>
-        <w:t xml:space="preserve"> </w:t>
-      </w:r>
-      <w:r>
-        <w:rPr>
           <w:i/>
-          <w:iCs/>
         </w:rPr>
         <w:t xml:space="preserve">each line of code</w:t>
       </w:r>
@@ -1929,8 +1929,8 @@
       </w:pPr>
       <w:r>
         <w:rPr>
+          <w:bCs/>
           <w:b/>
-          <w:bCs/>
         </w:rPr>
         <w:t xml:space="preserve">Directly in the console</w:t>
       </w:r>
@@ -1962,8 +1962,8 @@
       </w:pPr>
       <w:r>
         <w:rPr>
+          <w:bCs/>
           <w:b/>
-          <w:bCs/>
         </w:rPr>
         <w:t xml:space="preserve">From a script</w:t>
       </w:r>
@@ -1996,11 +1996,11 @@
     </w:p>
     <w:p>
       <w:pPr>
-        <w:pStyle w:val="Compact"/>
         <w:numPr>
           <w:ilvl w:val="0"/>
           <w:numId w:val="1006"/>
         </w:numPr>
+        <w:pStyle w:val="Compact"/>
       </w:pPr>
       <w:r>
         <w:t xml:space="preserve">Click the</w:t>
@@ -2026,11 +2026,11 @@
     </w:p>
     <w:p>
       <w:pPr>
-        <w:pStyle w:val="Compact"/>
         <w:numPr>
           <w:ilvl w:val="0"/>
           <w:numId w:val="1006"/>
         </w:numPr>
+        <w:pStyle w:val="Compact"/>
       </w:pPr>
       <w:r>
         <w:t xml:space="preserve">Press</w:t>
@@ -2089,16 +2089,67 @@
       </w:r>
       <w:r>
         <w:rPr>
+          <w:iCs/>
           <w:i/>
+        </w:rPr>
+        <w:t xml:space="preserve">weird</w:t>
+      </w:r>
+      <w:r>
+        <w:t xml:space="preserve"> </w:t>
+      </w:r>
+      <w:r>
+        <w:t xml:space="preserve">things in the data that might indicate mistakes, such as data entry errors. In real-world analysis, this step is incredibly important because mistakes are easily made, especially during data entry. Imagine entering 5,000 nearly identical observations into an Excel document. People get bored, start thinking about other things, get mixed up about which observation they should be adding, among many other distractions. It’s hard to stay super focused during mundane work for long periods. It would be unrealistic to expect or assume that mistakes would never happen, so we need to check for them. The problem is that if we don’t spot these errors, they can significantly influence the results when it comes time to analyze the data.</w:t>
+      </w:r>
+    </w:p>
+    <w:p>
+      <w:pPr>
+        <w:pStyle w:val="BodyText"/>
+      </w:pPr>
+      <w:r>
+        <w:t xml:space="preserve">The good news is that we don’t need any complex statistics to check for these issues, and the</w:t>
+      </w:r>
+      <w:r>
+        <w:t xml:space="preserve"> </w:t>
+      </w:r>
+      <w:r>
+        <w:rPr>
+          <w:rStyle w:val="VerbatimChar"/>
+        </w:rPr>
+        <w:t xml:space="preserve">R</w:t>
+      </w:r>
+      <w:r>
+        <w:t xml:space="preserve"> </w:t>
+      </w:r>
+      <w:r>
+        <w:t xml:space="preserve">coding is</w:t>
+      </w:r>
+      <w:r>
+        <w:t xml:space="preserve"> </w:t>
+      </w:r>
+      <w:r>
+        <w:rPr>
           <w:iCs/>
-        </w:rPr>
-        <w:t xml:space="preserve">weird</w:t>
-      </w:r>
-      <w:r>
-        <w:t xml:space="preserve"> </w:t>
-      </w:r>
-      <w:r>
-        <w:t xml:space="preserve">things in the data that might indicate mistakes, such as data entry errors. In real-world analysis, this step is incredibly important because mistakes are easily made, especially during data entry. Imagine entering 5,000 nearly identical observations into an Excel document. People get bored, start thinking about other things, get mixed up about which observation they should be adding, among many other distractions. It’s hard to stay super focused during mundane work for long periods. It would be unrealistic to expect or assume that mistakes would never happen, so we need to check for them. The problem is that if we don’t spot these errors, they can significantly influence the results when it comes time to analyze the data.</w:t>
+          <w:i/>
+        </w:rPr>
+        <w:t xml:space="preserve">relatively</w:t>
+      </w:r>
+      <w:r>
+        <w:t xml:space="preserve"> </w:t>
+      </w:r>
+      <w:r>
+        <w:t xml:space="preserve">straightforward. The first step is to load the data into</w:t>
+      </w:r>
+      <w:r>
+        <w:t xml:space="preserve"> </w:t>
+      </w:r>
+      <w:r>
+        <w:rPr>
+          <w:rStyle w:val="VerbatimChar"/>
+        </w:rPr>
+        <w:t xml:space="preserve">R</w:t>
+      </w:r>
+      <w:r>
+        <w:t xml:space="preserve">.</w:t>
       </w:r>
     </w:p>
     <w:p>
@@ -2106,7 +2157,7 @@
         <w:pStyle w:val="BodyText"/>
       </w:pPr>
       <w:r>
-        <w:t xml:space="preserve">The good news is that we don’t need any complex statistics to check for these issues, and the</w:t>
+        <w:t xml:space="preserve">We would like you to use RStudio, an Integrated Development Environment. Essentially, it’s a program that makes interacting with</w:t>
       </w:r>
       <w:r>
         <w:t xml:space="preserve"> </w:t>
@@ -2121,23 +2172,265 @@
         <w:t xml:space="preserve"> </w:t>
       </w:r>
       <w:r>
-        <w:t xml:space="preserve">coding is</w:t>
-      </w:r>
-      <w:r>
-        <w:t xml:space="preserve"> </w:t>
-      </w:r>
-      <w:r>
-        <w:rPr>
-          <w:i/>
-          <w:iCs/>
-        </w:rPr>
-        <w:t xml:space="preserve">relatively</w:t>
-      </w:r>
-      <w:r>
-        <w:t xml:space="preserve"> </w:t>
-      </w:r>
-      <w:r>
-        <w:t xml:space="preserve">straightforward. The first step is to load the data into</w:t>
+        <w:t xml:space="preserve">(the programming language) a much more pleasant experience. If you have not used RStudio before, please refer to the instructions on MyAberdeen titled</w:t>
+      </w:r>
+      <w:r>
+        <w:t xml:space="preserve"> </w:t>
+      </w:r>
+      <w:r>
+        <w:t xml:space="preserve">“</w:t>
+      </w:r>
+      <w:r>
+        <w:t xml:space="preserve">Getting Started with R and RStudio.</w:t>
+      </w:r>
+      <w:r>
+        <w:t xml:space="preserve">”</w:t>
+      </w:r>
+    </w:p>
+    <w:bookmarkStart w:id="31" w:name="set-working-directory"/>
+    <w:p>
+      <w:pPr>
+        <w:pStyle w:val="Heading2"/>
+      </w:pPr>
+      <w:r>
+        <w:t xml:space="preserve">Set working directory</w:t>
+      </w:r>
+    </w:p>
+    <w:p>
+      <w:pPr>
+        <w:pStyle w:val="FirstParagraph"/>
+      </w:pPr>
+      <w:r>
+        <w:t xml:space="preserve">If you haven’t already created a folder for the course on your computer or your university drive, do so now. For example, you might create a folder in your</w:t>
+      </w:r>
+      <w:r>
+        <w:t xml:space="preserve"> </w:t>
+      </w:r>
+      <w:r>
+        <w:rPr>
+          <w:rStyle w:val="VerbatimChar"/>
+        </w:rPr>
+        <w:t xml:space="preserve">H</w:t>
+      </w:r>
+      <w:r>
+        <w:t xml:space="preserve"> </w:t>
+      </w:r>
+      <w:r>
+        <w:t xml:space="preserve">drive for the course, with subfolders for each of the workshops (e.g.,</w:t>
+      </w:r>
+      <w:r>
+        <w:t xml:space="preserve"> </w:t>
+      </w:r>
+      <w:r>
+        <w:rPr>
+          <w:rStyle w:val="VerbatimChar"/>
+        </w:rPr>
+        <w:t xml:space="preserve">workshop1</w:t>
+      </w:r>
+      <w:r>
+        <w:t xml:space="preserve">), such that the file path to your working directory would be:</w:t>
+      </w:r>
+      <w:r>
+        <w:t xml:space="preserve"> </w:t>
+      </w:r>
+      <w:r>
+        <w:rPr>
+          <w:rStyle w:val="VerbatimChar"/>
+        </w:rPr>
+        <w:t xml:space="preserve">H:\BI3010\workshop1</w:t>
+      </w:r>
+      <w:r>
+        <w:t xml:space="preserve">.</w:t>
+      </w:r>
+    </w:p>
+    <w:p>
+      <w:pPr>
+        <w:pStyle w:val="BodyText"/>
+      </w:pPr>
+      <w:r>
+        <w:t xml:space="preserve">Open RStudio and create a new R script (</w:t>
+      </w:r>
+      <w:r>
+        <w:rPr>
+          <w:rStyle w:val="VerbatimChar"/>
+        </w:rPr>
+        <w:t xml:space="preserve">File</w:t>
+      </w:r>
+      <w:r>
+        <w:t xml:space="preserve"> </w:t>
+      </w:r>
+      <w:r>
+        <w:t xml:space="preserve">&gt;</w:t>
+      </w:r>
+      <w:r>
+        <w:t xml:space="preserve"> </w:t>
+      </w:r>
+      <w:r>
+        <w:rPr>
+          <w:rStyle w:val="VerbatimChar"/>
+        </w:rPr>
+        <w:t xml:space="preserve">New File</w:t>
+      </w:r>
+      <w:r>
+        <w:t xml:space="preserve"> </w:t>
+      </w:r>
+      <w:r>
+        <w:t xml:space="preserve">&gt;</w:t>
+      </w:r>
+      <w:r>
+        <w:t xml:space="preserve"> </w:t>
+      </w:r>
+      <w:r>
+        <w:rPr>
+          <w:rStyle w:val="VerbatimChar"/>
+        </w:rPr>
+        <w:t xml:space="preserve">R Script</w:t>
+      </w:r>
+      <w:r>
+        <w:t xml:space="preserve">, or use the hotkeys</w:t>
+      </w:r>
+      <w:r>
+        <w:t xml:space="preserve"> </w:t>
+      </w:r>
+      <w:r>
+        <w:rPr>
+          <w:rStyle w:val="VerbatimChar"/>
+        </w:rPr>
+        <w:t xml:space="preserve">Ctrl + Shift + N</w:t>
+      </w:r>
+      <w:r>
+        <w:t xml:space="preserve">). Once open, you can now write code in the script. When you want to run that code, either press the</w:t>
+      </w:r>
+      <w:r>
+        <w:t xml:space="preserve"> </w:t>
+      </w:r>
+      <w:r>
+        <w:t xml:space="preserve">“</w:t>
+      </w:r>
+      <w:r>
+        <w:t xml:space="preserve">Run</w:t>
+      </w:r>
+      <w:r>
+        <w:t xml:space="preserve">”</w:t>
+      </w:r>
+      <w:r>
+        <w:t xml:space="preserve"> </w:t>
+      </w:r>
+      <w:r>
+        <w:t xml:space="preserve">button (top right of the main panel) or click anywhere in a line of code and use the hotkeys</w:t>
+      </w:r>
+      <w:r>
+        <w:t xml:space="preserve"> </w:t>
+      </w:r>
+      <w:r>
+        <w:rPr>
+          <w:rStyle w:val="VerbatimChar"/>
+        </w:rPr>
+        <w:t xml:space="preserve">Ctrl + Enter</w:t>
+      </w:r>
+      <w:r>
+        <w:t xml:space="preserve">.</w:t>
+      </w:r>
+    </w:p>
+    <w:p>
+      <w:pPr>
+        <w:pStyle w:val="BodyText"/>
+      </w:pPr>
+      <w:r>
+        <w:t xml:space="preserve">With your script now open, to set the working directory to the folder you want to use for saving your work, you have two options:</w:t>
+      </w:r>
+    </w:p>
+    <w:p>
+      <w:pPr>
+        <w:pStyle w:val="BodyText"/>
+      </w:pPr>
+      <w:r>
+        <w:rPr>
+          <w:bCs/>
+          <w:b/>
+        </w:rPr>
+        <w:t xml:space="preserve">Option 1:</w:t>
+      </w:r>
+    </w:p>
+    <w:p>
+      <w:pPr>
+        <w:pStyle w:val="BodyText"/>
+      </w:pPr>
+      <w:r>
+        <w:t xml:space="preserve">Find the file path for your newly created folder (e.g. </w:t>
+      </w:r>
+      <w:r>
+        <w:rPr>
+          <w:rStyle w:val="VerbatimChar"/>
+        </w:rPr>
+        <w:t xml:space="preserve">H:</w:t>
+      </w:r>
+      <w:r>
+        <w:t xml:space="preserve"> </w:t>
+      </w:r>
+      <w:r>
+        <w:t xml:space="preserve">&gt;</w:t>
+      </w:r>
+      <w:r>
+        <w:t xml:space="preserve"> </w:t>
+      </w:r>
+      <w:r>
+        <w:rPr>
+          <w:rStyle w:val="VerbatimChar"/>
+        </w:rPr>
+        <w:t xml:space="preserve">BI3010</w:t>
+      </w:r>
+      <w:r>
+        <w:t xml:space="preserve"> </w:t>
+      </w:r>
+      <w:r>
+        <w:t xml:space="preserve">&gt;</w:t>
+      </w:r>
+      <w:r>
+        <w:t xml:space="preserve"> </w:t>
+      </w:r>
+      <w:r>
+        <w:rPr>
+          <w:rStyle w:val="VerbatimChar"/>
+        </w:rPr>
+        <w:t xml:space="preserve">workshop1</w:t>
+      </w:r>
+      <w:r>
+        <w:t xml:space="preserve">). If you’re not sure, an easy way to get this is by using File Explorer in Windows, go to your</w:t>
+      </w:r>
+      <w:r>
+        <w:t xml:space="preserve"> </w:t>
+      </w:r>
+      <w:r>
+        <w:rPr>
+          <w:rStyle w:val="VerbatimChar"/>
+        </w:rPr>
+        <w:t xml:space="preserve">workshop1</w:t>
+      </w:r>
+      <w:r>
+        <w:t xml:space="preserve"> </w:t>
+      </w:r>
+      <w:r>
+        <w:t xml:space="preserve">folder, then select the address (or file path) from the navigation bar at the top (the equivalent of the URL bar in web browsers). It will probably look something like:</w:t>
+      </w:r>
+    </w:p>
+    <w:p>
+      <w:pPr>
+        <w:pStyle w:val="BodyText"/>
+      </w:pPr>
+      <w:r>
+        <w:rPr>
+          <w:rStyle w:val="VerbatimChar"/>
+        </w:rPr>
+        <w:t xml:space="preserve">H:\BI3010\workshop1</w:t>
+      </w:r>
+    </w:p>
+    <w:p>
+      <w:pPr>
+        <w:pStyle w:val="BodyText"/>
+      </w:pPr>
+      <w:r>
+        <w:t xml:space="preserve">In</w:t>
       </w:r>
       <w:r>
         <w:t xml:space="preserve"> </w:t>
@@ -2149,6 +2442,49 @@
         <w:t xml:space="preserve">R</w:t>
       </w:r>
       <w:r>
+        <w:t xml:space="preserve">, backslashes are used for specific purposes, so we want to change the backslashes to forward slashes. To get our file path ready for</w:t>
+      </w:r>
+      <w:r>
+        <w:t xml:space="preserve"> </w:t>
+      </w:r>
+      <w:r>
+        <w:rPr>
+          <w:rStyle w:val="VerbatimChar"/>
+        </w:rPr>
+        <w:t xml:space="preserve">R</w:t>
+      </w:r>
+      <w:r>
+        <w:t xml:space="preserve">, it should look like:</w:t>
+      </w:r>
+    </w:p>
+    <w:p>
+      <w:pPr>
+        <w:pStyle w:val="BodyText"/>
+      </w:pPr>
+      <w:r>
+        <w:rPr>
+          <w:rStyle w:val="VerbatimChar"/>
+        </w:rPr>
+        <w:t xml:space="preserve">H:/BI3010/workshop1</w:t>
+      </w:r>
+    </w:p>
+    <w:p>
+      <w:pPr>
+        <w:pStyle w:val="BodyText"/>
+      </w:pPr>
+      <w:r>
+        <w:t xml:space="preserve">If you’re using a Mac, your working directory may be something like:</w:t>
+      </w:r>
+      <w:r>
+        <w:t xml:space="preserve"> </w:t>
+      </w:r>
+      <w:r>
+        <w:rPr>
+          <w:rStyle w:val="VerbatimChar"/>
+        </w:rPr>
+        <w:t xml:space="preserve">~/Documents/BI3010/workshop1</w:t>
+      </w:r>
+      <w:r>
         <w:t xml:space="preserve">.</w:t>
       </w:r>
     </w:p>
@@ -2157,7 +2493,7 @@
         <w:pStyle w:val="BodyText"/>
       </w:pPr>
       <w:r>
-        <w:t xml:space="preserve">We would like you to use RStudio, an Integrated Development Environment. Essentially, it’s a program that makes interacting with</w:t>
+        <w:t xml:space="preserve">We can now write some</w:t>
       </w:r>
       <w:r>
         <w:t xml:space="preserve"> </w:t>
@@ -2172,7 +2508,49 @@
         <w:t xml:space="preserve"> </w:t>
       </w:r>
       <w:r>
-        <w:t xml:space="preserve">(the programming language) a much more pleasant experience. If you have not used RStudio before, please refer to the instructions on MyAberdeen titled</w:t>
+        <w:t xml:space="preserve">code to tell</w:t>
+      </w:r>
+      <w:r>
+        <w:t xml:space="preserve"> </w:t>
+      </w:r>
+      <w:r>
+        <w:rPr>
+          <w:rStyle w:val="VerbatimChar"/>
+        </w:rPr>
+        <w:t xml:space="preserve">R</w:t>
+      </w:r>
+      <w:r>
+        <w:t xml:space="preserve"> </w:t>
+      </w:r>
+      <w:r>
+        <w:t xml:space="preserve">that this is the folder that we will be using in the current session, by setting the Working Directory using the function</w:t>
+      </w:r>
+      <w:r>
+        <w:t xml:space="preserve"> </w:t>
+      </w:r>
+      <w:r>
+        <w:rPr>
+          <w:rStyle w:val="VerbatimChar"/>
+        </w:rPr>
+        <w:t xml:space="preserve">setwd()</w:t>
+      </w:r>
+      <w:r>
+        <w:t xml:space="preserve">. The</w:t>
+      </w:r>
+      <w:r>
+        <w:t xml:space="preserve"> </w:t>
+      </w:r>
+      <w:r>
+        <w:rPr>
+          <w:rStyle w:val="VerbatimChar"/>
+        </w:rPr>
+        <w:t xml:space="preserve">setwd()</w:t>
+      </w:r>
+      <w:r>
+        <w:t xml:space="preserve"> </w:t>
+      </w:r>
+      <w:r>
+        <w:t xml:space="preserve">function just needs a single piece of information (technically called an</w:t>
       </w:r>
       <w:r>
         <w:t xml:space="preserve"> </w:t>
@@ -2181,19 +2559,96 @@
         <w:t xml:space="preserve">“</w:t>
       </w:r>
       <w:r>
-        <w:t xml:space="preserve">Getting Started with R and RStudio.</w:t>
+        <w:t xml:space="preserve">argument</w:t>
       </w:r>
       <w:r>
         <w:t xml:space="preserve">”</w:t>
       </w:r>
-    </w:p>
-    <w:bookmarkStart w:id="31" w:name="set-working-directory"/>
-    <w:p>
-      <w:pPr>
-        <w:pStyle w:val="Heading2"/>
-      </w:pPr>
-      <w:r>
-        <w:t xml:space="preserve">Set working directory</w:t>
+      <w:r>
+        <w:t xml:space="preserve">), which is the file path. However, because the file path is a</w:t>
+      </w:r>
+      <w:r>
+        <w:t xml:space="preserve"> </w:t>
+      </w:r>
+      <w:r>
+        <w:t xml:space="preserve">“</w:t>
+      </w:r>
+      <w:r>
+        <w:t xml:space="preserve">string</w:t>
+      </w:r>
+      <w:r>
+        <w:t xml:space="preserve">”</w:t>
+      </w:r>
+      <w:r>
+        <w:t xml:space="preserve"> </w:t>
+      </w:r>
+      <w:r>
+        <w:t xml:space="preserve">(i.e., a bunch of letters, characters, and numbers), we need to ensure that we put the file path in quotation marks:</w:t>
+      </w:r>
+    </w:p>
+    <w:p>
+      <w:pPr>
+        <w:pStyle w:val="SourceCode"/>
+      </w:pPr>
+      <w:r>
+        <w:rPr>
+          <w:rStyle w:val="FunctionTok"/>
+        </w:rPr>
+        <w:t xml:space="preserve">setwd</w:t>
+      </w:r>
+      <w:r>
+        <w:rPr>
+          <w:rStyle w:val="NormalTok"/>
+        </w:rPr>
+        <w:t xml:space="preserve">(</w:t>
+      </w:r>
+      <w:r>
+        <w:rPr>
+          <w:rStyle w:val="StringTok"/>
+        </w:rPr>
+        <w:t xml:space="preserve">"H:/BI3010/workshop1"</w:t>
+      </w:r>
+      <w:r>
+        <w:rPr>
+          <w:rStyle w:val="NormalTok"/>
+        </w:rPr>
+        <w:t xml:space="preserve">)</w:t>
+      </w:r>
+      <w:r>
+        <w:br/>
+      </w:r>
+      <w:r>
+        <w:rPr>
+          <w:rStyle w:val="CommentTok"/>
+        </w:rPr>
+        <w:t xml:space="preserve"># Or for Mac:</w:t>
+      </w:r>
+      <w:r>
+        <w:br/>
+      </w:r>
+      <w:r>
+        <w:rPr>
+          <w:rStyle w:val="FunctionTok"/>
+        </w:rPr>
+        <w:t xml:space="preserve">setwd</w:t>
+      </w:r>
+      <w:r>
+        <w:rPr>
+          <w:rStyle w:val="NormalTok"/>
+        </w:rPr>
+        <w:t xml:space="preserve">(</w:t>
+      </w:r>
+      <w:r>
+        <w:rPr>
+          <w:rStyle w:val="StringTok"/>
+        </w:rPr>
+        <w:t xml:space="preserve">"~/Documents/BI3010/workshop1"</w:t>
+      </w:r>
+      <w:r>
+        <w:rPr>
+          <w:rStyle w:val="NormalTok"/>
+        </w:rPr>
+        <w:t xml:space="preserve">)</w:t>
       </w:r>
     </w:p>
     <w:p>
@@ -2201,22 +2656,22 @@
         <w:pStyle w:val="FirstParagraph"/>
       </w:pPr>
       <w:r>
-        <w:t xml:space="preserve">If you haven’t already created a folder for the course on your computer or your university drive, do so now. For example, you might create a folder in your</w:t>
-      </w:r>
-      <w:r>
-        <w:t xml:space="preserve"> </w:t>
-      </w:r>
-      <w:r>
-        <w:rPr>
-          <w:rStyle w:val="VerbatimChar"/>
-        </w:rPr>
-        <w:t xml:space="preserve">H</w:t>
-      </w:r>
-      <w:r>
-        <w:t xml:space="preserve"> </w:t>
-      </w:r>
-      <w:r>
-        <w:t xml:space="preserve">drive for the course, with subfolders for each of the workshops (e.g.,</w:t>
+        <w:t xml:space="preserve">The benefit of doing it this way is that because we can include this code in our</w:t>
+      </w:r>
+      <w:r>
+        <w:t xml:space="preserve"> </w:t>
+      </w:r>
+      <w:r>
+        <w:rPr>
+          <w:rStyle w:val="VerbatimChar"/>
+        </w:rPr>
+        <w:t xml:space="preserve">R</w:t>
+      </w:r>
+      <w:r>
+        <w:t xml:space="preserve"> </w:t>
+      </w:r>
+      <w:r>
+        <w:t xml:space="preserve">script, we don’t have to go through this pain of setting the working directory every time we come back to work on this script. It also means we can copy and paste this code when we get to subsequent workshops, just changing</w:t>
       </w:r>
       <w:r>
         <w:t xml:space="preserve"> </w:t>
@@ -2228,16 +2683,19 @@
         <w:t xml:space="preserve">workshop1</w:t>
       </w:r>
       <w:r>
-        <w:t xml:space="preserve">), such that the file path to your working directory would be:</w:t>
-      </w:r>
-      <w:r>
-        <w:t xml:space="preserve"> </w:t>
-      </w:r>
-      <w:r>
-        <w:rPr>
-          <w:rStyle w:val="VerbatimChar"/>
-        </w:rPr>
-        <w:t xml:space="preserve">H:\BI3010\workshop1</w:t>
+        <w:t xml:space="preserve"> </w:t>
+      </w:r>
+      <w:r>
+        <w:t xml:space="preserve">with, for example,</w:t>
+      </w:r>
+      <w:r>
+        <w:t xml:space="preserve"> </w:t>
+      </w:r>
+      <w:r>
+        <w:rPr>
+          <w:rStyle w:val="VerbatimChar"/>
+        </w:rPr>
+        <w:t xml:space="preserve">workshop2</w:t>
       </w:r>
       <w:r>
         <w:t xml:space="preserve">.</w:t>
@@ -2248,467 +2706,9 @@
         <w:pStyle w:val="BodyText"/>
       </w:pPr>
       <w:r>
-        <w:t xml:space="preserve">Open RStudio and create a new R script (</w:t>
-      </w:r>
-      <w:r>
-        <w:rPr>
-          <w:rStyle w:val="VerbatimChar"/>
-        </w:rPr>
-        <w:t xml:space="preserve">File</w:t>
-      </w:r>
-      <w:r>
-        <w:t xml:space="preserve"> </w:t>
-      </w:r>
-      <w:r>
-        <w:t xml:space="preserve">&gt;</w:t>
-      </w:r>
-      <w:r>
-        <w:t xml:space="preserve"> </w:t>
-      </w:r>
-      <w:r>
-        <w:rPr>
-          <w:rStyle w:val="VerbatimChar"/>
-        </w:rPr>
-        <w:t xml:space="preserve">New File</w:t>
-      </w:r>
-      <w:r>
-        <w:t xml:space="preserve"> </w:t>
-      </w:r>
-      <w:r>
-        <w:t xml:space="preserve">&gt;</w:t>
-      </w:r>
-      <w:r>
-        <w:t xml:space="preserve"> </w:t>
-      </w:r>
-      <w:r>
-        <w:rPr>
-          <w:rStyle w:val="VerbatimChar"/>
-        </w:rPr>
-        <w:t xml:space="preserve">R Script</w:t>
-      </w:r>
-      <w:r>
-        <w:t xml:space="preserve">, or use the hotkeys</w:t>
-      </w:r>
-      <w:r>
-        <w:t xml:space="preserve"> </w:t>
-      </w:r>
-      <w:r>
-        <w:rPr>
-          <w:rStyle w:val="VerbatimChar"/>
-        </w:rPr>
-        <w:t xml:space="preserve">Ctrl + Shift + N</w:t>
-      </w:r>
-      <w:r>
-        <w:t xml:space="preserve">). Once open, you can now write code in the script. When you want to run that code, either press the</w:t>
-      </w:r>
-      <w:r>
-        <w:t xml:space="preserve"> </w:t>
-      </w:r>
-      <w:r>
-        <w:t xml:space="preserve">“</w:t>
-      </w:r>
-      <w:r>
-        <w:t xml:space="preserve">Run</w:t>
-      </w:r>
-      <w:r>
-        <w:t xml:space="preserve">”</w:t>
-      </w:r>
-      <w:r>
-        <w:t xml:space="preserve"> </w:t>
-      </w:r>
-      <w:r>
-        <w:t xml:space="preserve">button (top right of the main panel) or click anywhere in a line of code and use the hotkeys</w:t>
-      </w:r>
-      <w:r>
-        <w:t xml:space="preserve"> </w:t>
-      </w:r>
-      <w:r>
-        <w:rPr>
-          <w:rStyle w:val="VerbatimChar"/>
-        </w:rPr>
-        <w:t xml:space="preserve">Ctrl + Enter</w:t>
-      </w:r>
-      <w:r>
-        <w:t xml:space="preserve">.</w:t>
-      </w:r>
-    </w:p>
-    <w:p>
-      <w:pPr>
-        <w:pStyle w:val="BodyText"/>
-      </w:pPr>
-      <w:r>
-        <w:t xml:space="preserve">With your script now open, to set the working directory to the folder you want to use for saving your work, you have two options:</w:t>
-      </w:r>
-    </w:p>
-    <w:p>
-      <w:pPr>
-        <w:pStyle w:val="BodyText"/>
-      </w:pPr>
-      <w:r>
-        <w:rPr>
+        <w:rPr>
+          <w:bCs/>
           <w:b/>
-          <w:bCs/>
-        </w:rPr>
-        <w:t xml:space="preserve">Option 1:</w:t>
-      </w:r>
-    </w:p>
-    <w:p>
-      <w:pPr>
-        <w:pStyle w:val="BodyText"/>
-      </w:pPr>
-      <w:r>
-        <w:t xml:space="preserve">Find the file path for your newly created folder (e.g. </w:t>
-      </w:r>
-      <w:r>
-        <w:rPr>
-          <w:rStyle w:val="VerbatimChar"/>
-        </w:rPr>
-        <w:t xml:space="preserve">H:</w:t>
-      </w:r>
-      <w:r>
-        <w:t xml:space="preserve"> </w:t>
-      </w:r>
-      <w:r>
-        <w:t xml:space="preserve">&gt;</w:t>
-      </w:r>
-      <w:r>
-        <w:t xml:space="preserve"> </w:t>
-      </w:r>
-      <w:r>
-        <w:rPr>
-          <w:rStyle w:val="VerbatimChar"/>
-        </w:rPr>
-        <w:t xml:space="preserve">BI3010</w:t>
-      </w:r>
-      <w:r>
-        <w:t xml:space="preserve"> </w:t>
-      </w:r>
-      <w:r>
-        <w:t xml:space="preserve">&gt;</w:t>
-      </w:r>
-      <w:r>
-        <w:t xml:space="preserve"> </w:t>
-      </w:r>
-      <w:r>
-        <w:rPr>
-          <w:rStyle w:val="VerbatimChar"/>
-        </w:rPr>
-        <w:t xml:space="preserve">workshop1</w:t>
-      </w:r>
-      <w:r>
-        <w:t xml:space="preserve">). If you’re not sure, an easy way to get this is by using File Explorer in Windows, go to your</w:t>
-      </w:r>
-      <w:r>
-        <w:t xml:space="preserve"> </w:t>
-      </w:r>
-      <w:r>
-        <w:rPr>
-          <w:rStyle w:val="VerbatimChar"/>
-        </w:rPr>
-        <w:t xml:space="preserve">workshop1</w:t>
-      </w:r>
-      <w:r>
-        <w:t xml:space="preserve"> </w:t>
-      </w:r>
-      <w:r>
-        <w:t xml:space="preserve">folder, then select the address (or file path) from the navigation bar at the top (the equivalent of the URL bar in web browsers). It will probably look something like:</w:t>
-      </w:r>
-    </w:p>
-    <w:p>
-      <w:pPr>
-        <w:pStyle w:val="BodyText"/>
-      </w:pPr>
-      <w:r>
-        <w:rPr>
-          <w:rStyle w:val="VerbatimChar"/>
-        </w:rPr>
-        <w:t xml:space="preserve">H:\BI3010\workshop1</w:t>
-      </w:r>
-    </w:p>
-    <w:p>
-      <w:pPr>
-        <w:pStyle w:val="BodyText"/>
-      </w:pPr>
-      <w:r>
-        <w:t xml:space="preserve">In</w:t>
-      </w:r>
-      <w:r>
-        <w:t xml:space="preserve"> </w:t>
-      </w:r>
-      <w:r>
-        <w:rPr>
-          <w:rStyle w:val="VerbatimChar"/>
-        </w:rPr>
-        <w:t xml:space="preserve">R</w:t>
-      </w:r>
-      <w:r>
-        <w:t xml:space="preserve">, backslashes are used for specific purposes, so we want to change the backslashes to forward slashes. To get our file path ready for</w:t>
-      </w:r>
-      <w:r>
-        <w:t xml:space="preserve"> </w:t>
-      </w:r>
-      <w:r>
-        <w:rPr>
-          <w:rStyle w:val="VerbatimChar"/>
-        </w:rPr>
-        <w:t xml:space="preserve">R</w:t>
-      </w:r>
-      <w:r>
-        <w:t xml:space="preserve">, it should look like:</w:t>
-      </w:r>
-    </w:p>
-    <w:p>
-      <w:pPr>
-        <w:pStyle w:val="BodyText"/>
-      </w:pPr>
-      <w:r>
-        <w:rPr>
-          <w:rStyle w:val="VerbatimChar"/>
-        </w:rPr>
-        <w:t xml:space="preserve">H:/BI3010/workshop1</w:t>
-      </w:r>
-    </w:p>
-    <w:p>
-      <w:pPr>
-        <w:pStyle w:val="BodyText"/>
-      </w:pPr>
-      <w:r>
-        <w:t xml:space="preserve">If you’re using a Mac, your working directory may be something like:</w:t>
-      </w:r>
-      <w:r>
-        <w:t xml:space="preserve"> </w:t>
-      </w:r>
-      <w:r>
-        <w:rPr>
-          <w:rStyle w:val="VerbatimChar"/>
-        </w:rPr>
-        <w:t xml:space="preserve">~/Documents/BI3010/workshop1</w:t>
-      </w:r>
-      <w:r>
-        <w:t xml:space="preserve">.</w:t>
-      </w:r>
-    </w:p>
-    <w:p>
-      <w:pPr>
-        <w:pStyle w:val="BodyText"/>
-      </w:pPr>
-      <w:r>
-        <w:t xml:space="preserve">We can now write some</w:t>
-      </w:r>
-      <w:r>
-        <w:t xml:space="preserve"> </w:t>
-      </w:r>
-      <w:r>
-        <w:rPr>
-          <w:rStyle w:val="VerbatimChar"/>
-        </w:rPr>
-        <w:t xml:space="preserve">R</w:t>
-      </w:r>
-      <w:r>
-        <w:t xml:space="preserve"> </w:t>
-      </w:r>
-      <w:r>
-        <w:t xml:space="preserve">code to tell</w:t>
-      </w:r>
-      <w:r>
-        <w:t xml:space="preserve"> </w:t>
-      </w:r>
-      <w:r>
-        <w:rPr>
-          <w:rStyle w:val="VerbatimChar"/>
-        </w:rPr>
-        <w:t xml:space="preserve">R</w:t>
-      </w:r>
-      <w:r>
-        <w:t xml:space="preserve"> </w:t>
-      </w:r>
-      <w:r>
-        <w:t xml:space="preserve">that this is the folder that we will be using in the current session, by setting the Working Directory using the function</w:t>
-      </w:r>
-      <w:r>
-        <w:t xml:space="preserve"> </w:t>
-      </w:r>
-      <w:r>
-        <w:rPr>
-          <w:rStyle w:val="VerbatimChar"/>
-        </w:rPr>
-        <w:t xml:space="preserve">setwd()</w:t>
-      </w:r>
-      <w:r>
-        <w:t xml:space="preserve">. The</w:t>
-      </w:r>
-      <w:r>
-        <w:t xml:space="preserve"> </w:t>
-      </w:r>
-      <w:r>
-        <w:rPr>
-          <w:rStyle w:val="VerbatimChar"/>
-        </w:rPr>
-        <w:t xml:space="preserve">setwd()</w:t>
-      </w:r>
-      <w:r>
-        <w:t xml:space="preserve"> </w:t>
-      </w:r>
-      <w:r>
-        <w:t xml:space="preserve">function just needs a single piece of information (technically called an</w:t>
-      </w:r>
-      <w:r>
-        <w:t xml:space="preserve"> </w:t>
-      </w:r>
-      <w:r>
-        <w:t xml:space="preserve">“</w:t>
-      </w:r>
-      <w:r>
-        <w:t xml:space="preserve">argument</w:t>
-      </w:r>
-      <w:r>
-        <w:t xml:space="preserve">”</w:t>
-      </w:r>
-      <w:r>
-        <w:t xml:space="preserve">), which is the file path. However, because the file path is a</w:t>
-      </w:r>
-      <w:r>
-        <w:t xml:space="preserve"> </w:t>
-      </w:r>
-      <w:r>
-        <w:t xml:space="preserve">“</w:t>
-      </w:r>
-      <w:r>
-        <w:t xml:space="preserve">string</w:t>
-      </w:r>
-      <w:r>
-        <w:t xml:space="preserve">”</w:t>
-      </w:r>
-      <w:r>
-        <w:t xml:space="preserve"> </w:t>
-      </w:r>
-      <w:r>
-        <w:t xml:space="preserve">(i.e., a bunch of letters, characters, and numbers), we need to ensure that we put the file path in quotation marks:</w:t>
-      </w:r>
-    </w:p>
-    <w:p>
-      <w:pPr>
-        <w:pStyle w:val="SourceCode"/>
-      </w:pPr>
-      <w:r>
-        <w:rPr>
-          <w:rStyle w:val="FunctionTok"/>
-        </w:rPr>
-        <w:t xml:space="preserve">setwd</w:t>
-      </w:r>
-      <w:r>
-        <w:rPr>
-          <w:rStyle w:val="NormalTok"/>
-        </w:rPr>
-        <w:t xml:space="preserve">(</w:t>
-      </w:r>
-      <w:r>
-        <w:rPr>
-          <w:rStyle w:val="StringTok"/>
-        </w:rPr>
-        <w:t xml:space="preserve">"H:/BI3010/workshop1"</w:t>
-      </w:r>
-      <w:r>
-        <w:rPr>
-          <w:rStyle w:val="NormalTok"/>
-        </w:rPr>
-        <w:t xml:space="preserve">)</w:t>
-      </w:r>
-      <w:r>
-        <w:br/>
-      </w:r>
-      <w:r>
-        <w:rPr>
-          <w:rStyle w:val="CommentTok"/>
-        </w:rPr>
-        <w:t xml:space="preserve"># Or for Mac:</w:t>
-      </w:r>
-      <w:r>
-        <w:br/>
-      </w:r>
-      <w:r>
-        <w:rPr>
-          <w:rStyle w:val="FunctionTok"/>
-        </w:rPr>
-        <w:t xml:space="preserve">setwd</w:t>
-      </w:r>
-      <w:r>
-        <w:rPr>
-          <w:rStyle w:val="NormalTok"/>
-        </w:rPr>
-        <w:t xml:space="preserve">(</w:t>
-      </w:r>
-      <w:r>
-        <w:rPr>
-          <w:rStyle w:val="StringTok"/>
-        </w:rPr>
-        <w:t xml:space="preserve">"~/Documents/BI3010/workshop1"</w:t>
-      </w:r>
-      <w:r>
-        <w:rPr>
-          <w:rStyle w:val="NormalTok"/>
-        </w:rPr>
-        <w:t xml:space="preserve">)</w:t>
-      </w:r>
-    </w:p>
-    <w:p>
-      <w:pPr>
-        <w:pStyle w:val="FirstParagraph"/>
-      </w:pPr>
-      <w:r>
-        <w:t xml:space="preserve">The benefit of doing it this way is that because we can include this code in our</w:t>
-      </w:r>
-      <w:r>
-        <w:t xml:space="preserve"> </w:t>
-      </w:r>
-      <w:r>
-        <w:rPr>
-          <w:rStyle w:val="VerbatimChar"/>
-        </w:rPr>
-        <w:t xml:space="preserve">R</w:t>
-      </w:r>
-      <w:r>
-        <w:t xml:space="preserve"> </w:t>
-      </w:r>
-      <w:r>
-        <w:t xml:space="preserve">script, we don’t have to go through this pain of setting the working directory every time we come back to work on this script. It also means we can copy and paste this code when we get to subsequent workshops, just changing</w:t>
-      </w:r>
-      <w:r>
-        <w:t xml:space="preserve"> </w:t>
-      </w:r>
-      <w:r>
-        <w:rPr>
-          <w:rStyle w:val="VerbatimChar"/>
-        </w:rPr>
-        <w:t xml:space="preserve">workshop1</w:t>
-      </w:r>
-      <w:r>
-        <w:t xml:space="preserve"> </w:t>
-      </w:r>
-      <w:r>
-        <w:t xml:space="preserve">with, for example,</w:t>
-      </w:r>
-      <w:r>
-        <w:t xml:space="preserve"> </w:t>
-      </w:r>
-      <w:r>
-        <w:rPr>
-          <w:rStyle w:val="VerbatimChar"/>
-        </w:rPr>
-        <w:t xml:space="preserve">workshop2</w:t>
-      </w:r>
-      <w:r>
-        <w:t xml:space="preserve">.</w:t>
-      </w:r>
-    </w:p>
-    <w:p>
-      <w:pPr>
-        <w:pStyle w:val="BodyText"/>
-      </w:pPr>
-      <w:r>
-        <w:rPr>
-          <w:b/>
-          <w:bCs/>
         </w:rPr>
         <w:t xml:space="preserve">Option 2:</w:t>
       </w:r>
@@ -2838,8 +2838,8 @@
       </w:pPr>
       <w:r>
         <w:rPr>
+          <w:iCs/>
           <w:i/>
-          <w:iCs/>
         </w:rPr>
         <w:t xml:space="preserve">You can download the data from MyAberdeen. Make sure to save the file to your working directory.</w:t>
       </w:r>
@@ -3768,26 +3768,633 @@
       </w:r>
       <w:r>
         <w:rPr>
+          <w:iCs/>
           <w:i/>
+        </w:rPr>
+        <w:t xml:space="preserve">weird</w:t>
+      </w:r>
+      <w:r>
+        <w:t xml:space="preserve">. In order to know if something is</w:t>
+      </w:r>
+      <w:r>
+        <w:t xml:space="preserve"> </w:t>
+      </w:r>
+      <w:r>
+        <w:rPr>
           <w:iCs/>
+          <w:i/>
         </w:rPr>
         <w:t xml:space="preserve">weird</w:t>
       </w:r>
       <w:r>
-        <w:t xml:space="preserve">. In order to know if something is</w:t>
-      </w:r>
-      <w:r>
-        <w:t xml:space="preserve"> </w:t>
-      </w:r>
-      <w:r>
-        <w:rPr>
+        <w:t xml:space="preserve">, we need to know what</w:t>
+      </w:r>
+      <w:r>
+        <w:t xml:space="preserve"> </w:t>
+      </w:r>
+      <w:r>
+        <w:t xml:space="preserve">“</w:t>
+      </w:r>
+      <w:r>
+        <w:t xml:space="preserve">normal</w:t>
+      </w:r>
+      <w:r>
+        <w:t xml:space="preserve">”</w:t>
+      </w:r>
+      <w:r>
+        <w:t xml:space="preserve"> </w:t>
+      </w:r>
+      <w:r>
+        <w:t xml:space="preserve">is; hence why it’s a good idea to have some sort of notion of what a</w:t>
+      </w:r>
+      <w:r>
+        <w:t xml:space="preserve"> </w:t>
+      </w:r>
+      <w:r>
+        <w:t xml:space="preserve">“</w:t>
+      </w:r>
+      <w:r>
+        <w:t xml:space="preserve">normal</w:t>
+      </w:r>
+      <w:r>
+        <w:t xml:space="preserve">”</w:t>
+      </w:r>
+      <w:r>
+        <w:t xml:space="preserve"> </w:t>
+      </w:r>
+      <w:r>
+        <w:t xml:space="preserve">alligator’s bite strength and length may be.</w:t>
+      </w:r>
+    </w:p>
+    <w:p>
+      <w:pPr>
+        <w:pStyle w:val="BodyText"/>
+      </w:pPr>
+      <w:r>
+        <w:t xml:space="preserve">Write down the average bite strength of an alligator, measured in pounds per square inch, and the average length of an alligator in centimeters (ideally as a comment in your script).</w:t>
+      </w:r>
+    </w:p>
+    <w:p>
+      <w:pPr>
+        <w:pStyle w:val="BodyText"/>
+      </w:pPr>
+      <w:r>
+        <w:t xml:space="preserve">With that done, let’s move on to understanding our data. For starters, let’s check if the data is sensibly structured. In</w:t>
+      </w:r>
+      <w:r>
+        <w:t xml:space="preserve"> </w:t>
+      </w:r>
+      <w:r>
+        <w:rPr>
+          <w:rStyle w:val="VerbatimChar"/>
+        </w:rPr>
+        <w:t xml:space="preserve">R</w:t>
+      </w:r>
+      <w:r>
+        <w:t xml:space="preserve">, this means that numbers are numbers, words are characters (or sometimes factors), and so on. Basically, we want to make sure there aren’t any bite measurements like</w:t>
+      </w:r>
+      <w:r>
+        <w:t xml:space="preserve"> </w:t>
+      </w:r>
+      <w:r>
+        <w:rPr>
+          <w:rStyle w:val="VerbatimChar"/>
+        </w:rPr>
+        <w:t xml:space="preserve">2174.94BIGBITE</w:t>
+      </w:r>
+      <w:r>
+        <w:t xml:space="preserve">, which would mess us up by causing</w:t>
+      </w:r>
+      <w:r>
+        <w:t xml:space="preserve"> </w:t>
+      </w:r>
+      <w:r>
+        <w:rPr>
+          <w:rStyle w:val="VerbatimChar"/>
+        </w:rPr>
+        <w:t xml:space="preserve">R</w:t>
+      </w:r>
+      <w:r>
+        <w:t xml:space="preserve"> </w:t>
+      </w:r>
+      <w:r>
+        <w:t xml:space="preserve">to think that all</w:t>
+      </w:r>
+      <w:r>
+        <w:t xml:space="preserve"> </w:t>
+      </w:r>
+      <w:r>
+        <w:rPr>
+          <w:rStyle w:val="VerbatimChar"/>
+        </w:rPr>
+        <w:t xml:space="preserve">bite</w:t>
+      </w:r>
+      <w:r>
+        <w:t xml:space="preserve"> </w:t>
+      </w:r>
+      <w:r>
+        <w:t xml:space="preserve">values are characters and not numbers.</w:t>
+      </w:r>
+    </w:p>
+    <w:p>
+      <w:pPr>
+        <w:pStyle w:val="BodyText"/>
+      </w:pPr>
+      <w:r>
+        <w:t xml:space="preserve">To do this quickly, we can use the</w:t>
+      </w:r>
+      <w:r>
+        <w:t xml:space="preserve"> </w:t>
+      </w:r>
+      <w:r>
+        <w:rPr>
+          <w:rStyle w:val="VerbatimChar"/>
+        </w:rPr>
+        <w:t xml:space="preserve">str()</w:t>
+      </w:r>
+      <w:r>
+        <w:t xml:space="preserve"> </w:t>
+      </w:r>
+      <w:r>
+        <w:t xml:space="preserve">function (short for</w:t>
+      </w:r>
+      <w:r>
+        <w:t xml:space="preserve"> </w:t>
+      </w:r>
+      <w:r>
+        <w:t xml:space="preserve">“</w:t>
+      </w:r>
+      <w:r>
+        <w:t xml:space="preserve">structure</w:t>
+      </w:r>
+      <w:r>
+        <w:t xml:space="preserve">”</w:t>
+      </w:r>
+      <w:r>
+        <w:t xml:space="preserve">):</w:t>
+      </w:r>
+    </w:p>
+    <w:p>
+      <w:pPr>
+        <w:pStyle w:val="SourceCode"/>
+      </w:pPr>
+      <w:r>
+        <w:rPr>
+          <w:rStyle w:val="FunctionTok"/>
+        </w:rPr>
+        <w:t xml:space="preserve">str</w:t>
+      </w:r>
+      <w:r>
+        <w:rPr>
+          <w:rStyle w:val="NormalTok"/>
+        </w:rPr>
+        <w:t xml:space="preserve">(ali)</w:t>
+      </w:r>
+    </w:p>
+    <w:p>
+      <w:pPr>
+        <w:pStyle w:val="FirstParagraph"/>
+      </w:pPr>
+      <w:r>
+        <w:t xml:space="preserve">We see that</w:t>
+      </w:r>
+      <w:r>
+        <w:t xml:space="preserve"> </w:t>
+      </w:r>
+      <w:r>
+        <w:rPr>
+          <w:rStyle w:val="VerbatimChar"/>
+        </w:rPr>
+        <w:t xml:space="preserve">ali</w:t>
+      </w:r>
+      <w:r>
+        <w:t xml:space="preserve"> </w:t>
+      </w:r>
+      <w:r>
+        <w:t xml:space="preserve">is a</w:t>
+      </w:r>
+      <w:r>
+        <w:t xml:space="preserve"> </w:t>
+      </w:r>
+      <w:r>
+        <w:rPr>
+          <w:rStyle w:val="VerbatimChar"/>
+        </w:rPr>
+        <w:t xml:space="preserve">data.frame</w:t>
+      </w:r>
+      <w:r>
+        <w:t xml:space="preserve"> </w:t>
+      </w:r>
+      <w:r>
+        <w:t xml:space="preserve">(great - it should be!), with 78 observations (or samples) and two variables. The</w:t>
+      </w:r>
+      <w:r>
+        <w:t xml:space="preserve"> </w:t>
+      </w:r>
+      <w:r>
+        <w:rPr>
+          <w:rStyle w:val="VerbatimChar"/>
+        </w:rPr>
+        <w:t xml:space="preserve">$</w:t>
+      </w:r>
+      <w:r>
+        <w:t xml:space="preserve"> </w:t>
+      </w:r>
+      <w:r>
+        <w:t xml:space="preserve">operator is used to extract specific variables from a dataframe, so</w:t>
+      </w:r>
+      <w:r>
+        <w:t xml:space="preserve"> </w:t>
+      </w:r>
+      <w:r>
+        <w:rPr>
+          <w:rStyle w:val="VerbatimChar"/>
+        </w:rPr>
+        <w:t xml:space="preserve">ali$bite</w:t>
+      </w:r>
+      <w:r>
+        <w:t xml:space="preserve"> </w:t>
+      </w:r>
+      <w:r>
+        <w:t xml:space="preserve">will give you just the</w:t>
+      </w:r>
+      <w:r>
+        <w:t xml:space="preserve"> </w:t>
+      </w:r>
+      <w:r>
+        <w:rPr>
+          <w:rStyle w:val="VerbatimChar"/>
+        </w:rPr>
+        <w:t xml:space="preserve">bite</w:t>
+      </w:r>
+      <w:r>
+        <w:t xml:space="preserve"> </w:t>
+      </w:r>
+      <w:r>
+        <w:t xml:space="preserve">variable from the</w:t>
+      </w:r>
+      <w:r>
+        <w:t xml:space="preserve"> </w:t>
+      </w:r>
+      <w:r>
+        <w:rPr>
+          <w:rStyle w:val="VerbatimChar"/>
+        </w:rPr>
+        <w:t xml:space="preserve">ali</w:t>
+      </w:r>
+      <w:r>
+        <w:t xml:space="preserve"> </w:t>
+      </w:r>
+      <w:r>
+        <w:t xml:space="preserve">dataset. This is why the second and third lines are preceded by</w:t>
+      </w:r>
+      <w:r>
+        <w:t xml:space="preserve"> </w:t>
+      </w:r>
+      <w:r>
+        <w:rPr>
+          <w:rStyle w:val="VerbatimChar"/>
+        </w:rPr>
+        <w:t xml:space="preserve">$</w:t>
+      </w:r>
+      <w:r>
+        <w:t xml:space="preserve">. From this, we can see that both the</w:t>
+      </w:r>
+      <w:r>
+        <w:t xml:space="preserve"> </w:t>
+      </w:r>
+      <w:r>
+        <w:rPr>
+          <w:rStyle w:val="VerbatimChar"/>
+        </w:rPr>
+        <w:t xml:space="preserve">length</w:t>
+      </w:r>
+      <w:r>
+        <w:t xml:space="preserve"> </w:t>
+      </w:r>
+      <w:r>
+        <w:t xml:space="preserve">and</w:t>
+      </w:r>
+      <w:r>
+        <w:t xml:space="preserve"> </w:t>
+      </w:r>
+      <w:r>
+        <w:rPr>
+          <w:rStyle w:val="VerbatimChar"/>
+        </w:rPr>
+        <w:t xml:space="preserve">bite</w:t>
+      </w:r>
+      <w:r>
+        <w:t xml:space="preserve"> </w:t>
+      </w:r>
+      <w:r>
+        <w:t xml:space="preserve">variables are being treated as numbers (indicated by</w:t>
+      </w:r>
+      <w:r>
+        <w:t xml:space="preserve"> </w:t>
+      </w:r>
+      <w:r>
+        <w:rPr>
+          <w:rStyle w:val="VerbatimChar"/>
+        </w:rPr>
+        <w:t xml:space="preserve">num</w:t>
+      </w:r>
+      <w:r>
+        <w:t xml:space="preserve">), and we get a handful of example values for both</w:t>
+      </w:r>
+      <w:r>
+        <w:t xml:space="preserve"> </w:t>
+      </w:r>
+      <w:r>
+        <w:rPr>
+          <w:rStyle w:val="VerbatimChar"/>
+        </w:rPr>
+        <w:t xml:space="preserve">length</w:t>
+      </w:r>
+      <w:r>
+        <w:t xml:space="preserve"> </w:t>
+      </w:r>
+      <w:r>
+        <w:t xml:space="preserve">and</w:t>
+      </w:r>
+      <w:r>
+        <w:t xml:space="preserve"> </w:t>
+      </w:r>
+      <w:r>
+        <w:rPr>
+          <w:rStyle w:val="VerbatimChar"/>
+        </w:rPr>
+        <w:t xml:space="preserve">bite</w:t>
+      </w:r>
+      <w:r>
+        <w:t xml:space="preserve">.</w:t>
+      </w:r>
+    </w:p>
+    <w:p>
+      <w:pPr>
+        <w:pStyle w:val="BodyText"/>
+      </w:pPr>
+      <w:r>
+        <w:t xml:space="preserve">So far, we’re not seeing anything unusual, which is great - it means we haven’t identified any problems that we need to fix.</w:t>
+      </w:r>
+    </w:p>
+    <w:p>
+      <w:pPr>
+        <w:pStyle w:val="BodyText"/>
+      </w:pPr>
+      <w:r>
+        <w:t xml:space="preserve">If we wanted to, we could extract the</w:t>
+      </w:r>
+      <w:r>
+        <w:t xml:space="preserve"> </w:t>
+      </w:r>
+      <w:r>
+        <w:rPr>
+          <w:rStyle w:val="VerbatimChar"/>
+        </w:rPr>
+        <w:t xml:space="preserve">length</w:t>
+      </w:r>
+      <w:r>
+        <w:t xml:space="preserve"> </w:t>
+      </w:r>
+      <w:r>
+        <w:t xml:space="preserve">variable from the dataset by doing:</w:t>
+      </w:r>
+    </w:p>
+    <w:p>
+      <w:pPr>
+        <w:pStyle w:val="SourceCode"/>
+      </w:pPr>
+      <w:r>
+        <w:rPr>
+          <w:rStyle w:val="NormalTok"/>
+        </w:rPr>
+        <w:t xml:space="preserve">ali</w:t>
+      </w:r>
+      <w:r>
+        <w:rPr>
+          <w:rStyle w:val="SpecialCharTok"/>
+        </w:rPr>
+        <w:t xml:space="preserve">$</w:t>
+      </w:r>
+      <w:r>
+        <w:rPr>
+          <w:rStyle w:val="NormalTok"/>
+        </w:rPr>
+        <w:t xml:space="preserve">length</w:t>
+      </w:r>
+    </w:p>
+    <w:p>
+      <w:pPr>
+        <w:pStyle w:val="FirstParagraph"/>
+      </w:pPr>
+      <w:r>
+        <w:t xml:space="preserve">How would you extract the</w:t>
+      </w:r>
+      <w:r>
+        <w:t xml:space="preserve"> </w:t>
+      </w:r>
+      <w:r>
+        <w:rPr>
+          <w:rStyle w:val="VerbatimChar"/>
+        </w:rPr>
+        <w:t xml:space="preserve">bite</w:t>
+      </w:r>
+      <w:r>
+        <w:t xml:space="preserve"> </w:t>
+      </w:r>
+      <w:r>
+        <w:t xml:space="preserve">variable?</w:t>
+      </w:r>
+    </w:p>
+    <w:p>
+      <w:pPr>
+        <w:pStyle w:val="BodyText"/>
+      </w:pPr>
+      <w:r>
+        <w:t xml:space="preserve">Let’s use these extracted variables to calculate some summary statistics, starting with the mean (i.e. average). To do so, we use the</w:t>
+      </w:r>
+      <w:r>
+        <w:t xml:space="preserve"> </w:t>
+      </w:r>
+      <w:r>
+        <w:rPr>
+          <w:rStyle w:val="VerbatimChar"/>
+        </w:rPr>
+        <w:t xml:space="preserve">mean()</w:t>
+      </w:r>
+      <w:r>
+        <w:t xml:space="preserve"> </w:t>
+      </w:r>
+      <w:r>
+        <w:t xml:space="preserve">function. To find the average length of our alligators, we do:</w:t>
+      </w:r>
+    </w:p>
+    <w:p>
+      <w:pPr>
+        <w:pStyle w:val="SourceCode"/>
+      </w:pPr>
+      <w:r>
+        <w:rPr>
+          <w:rStyle w:val="FunctionTok"/>
+        </w:rPr>
+        <w:t xml:space="preserve">mean</w:t>
+      </w:r>
+      <w:r>
+        <w:rPr>
+          <w:rStyle w:val="NormalTok"/>
+        </w:rPr>
+        <w:t xml:space="preserve">(ali</w:t>
+      </w:r>
+      <w:r>
+        <w:rPr>
+          <w:rStyle w:val="SpecialCharTok"/>
+        </w:rPr>
+        <w:t xml:space="preserve">$</w:t>
+      </w:r>
+      <w:r>
+        <w:rPr>
+          <w:rStyle w:val="NormalTok"/>
+        </w:rPr>
+        <w:t xml:space="preserve">length)</w:t>
+      </w:r>
+    </w:p>
+    <w:p>
+      <w:pPr>
+        <w:pStyle w:val="FirstParagraph"/>
+      </w:pPr>
+      <w:r>
+        <w:t xml:space="preserve">We can see that the average alligator in Parker Island Gator Farm is 374 cm long.</w:t>
+      </w:r>
+    </w:p>
+    <w:p>
+      <w:pPr>
+        <w:pStyle w:val="BodyText"/>
+      </w:pPr>
+      <w:r>
+        <w:t xml:space="preserve">Compare this value with the mean length of alligators you found from a quick internet search. It might be a bit longer than expected, but this could be due to these alligators coming from a farm rather than the wild. Perhaps they’re given lots of food to help them grow? While our numbers may not match exactly with online data, significant discrepancies could be worth investigating.</w:t>
+      </w:r>
+    </w:p>
+    <w:p>
+      <w:pPr>
+        <w:pStyle w:val="BodyText"/>
+      </w:pPr>
+      <w:r>
+        <w:t xml:space="preserve">Similarly, calculate the average bite strength of our alligators and see if there’s anything unusual there.</w:t>
+      </w:r>
+    </w:p>
+    <w:p>
+      <w:pPr>
+        <w:pStyle w:val="SourceCode"/>
+      </w:pPr>
+      <w:r>
+        <w:rPr>
+          <w:rStyle w:val="FunctionTok"/>
+        </w:rPr>
+        <w:t xml:space="preserve">mean</w:t>
+      </w:r>
+      <w:r>
+        <w:rPr>
+          <w:rStyle w:val="NormalTok"/>
+        </w:rPr>
+        <w:t xml:space="preserve">(ali</w:t>
+      </w:r>
+      <w:r>
+        <w:rPr>
+          <w:rStyle w:val="SpecialCharTok"/>
+        </w:rPr>
+        <w:t xml:space="preserve">$</w:t>
+      </w:r>
+      <w:r>
+        <w:rPr>
+          <w:rStyle w:val="NormalTok"/>
+        </w:rPr>
+        <w:t xml:space="preserve">bite)</w:t>
+      </w:r>
+    </w:p>
+    <w:p>
+      <w:pPr>
+        <w:pStyle w:val="FirstParagraph"/>
+      </w:pPr>
+      <w:r>
+        <w:t xml:space="preserve">Assuming you found that alligator bite strength is roughly 2,000 pounds per square inch, our alligators appear to be biting with an extra 1,500 pounds per square inch</w:t>
+      </w:r>
+      <w:r>
+        <w:t xml:space="preserve"> </w:t>
+      </w:r>
+      <w:r>
+        <w:rPr>
+          <w:iCs/>
           <w:i/>
+        </w:rPr>
+        <w:t xml:space="preserve">on average</w:t>
+      </w:r>
+      <w:r>
+        <w:t xml:space="preserve">. That seems like</w:t>
+      </w:r>
+      <w:r>
+        <w:t xml:space="preserve"> </w:t>
+      </w:r>
+      <w:r>
+        <w:rPr>
           <w:iCs/>
-        </w:rPr>
-        <w:t xml:space="preserve">weird</w:t>
-      </w:r>
-      <w:r>
-        <w:t xml:space="preserve">, we need to know what</w:t>
+          <w:i/>
+        </w:rPr>
+        <w:t xml:space="preserve">a lot</w:t>
+      </w:r>
+      <w:r>
+        <w:t xml:space="preserve"> </w:t>
+      </w:r>
+      <w:r>
+        <w:t xml:space="preserve">more.</w:t>
+      </w:r>
+    </w:p>
+    <w:p>
+      <w:pPr>
+        <w:pStyle w:val="BodyText"/>
+      </w:pPr>
+      <w:r>
+        <w:t xml:space="preserve">This is something that should make us sit up and pay attention. We don’t know for sure if there’s a problem, but we have reason to believe there</w:t>
+      </w:r>
+      <w:r>
+        <w:t xml:space="preserve"> </w:t>
+      </w:r>
+      <w:r>
+        <w:rPr>
+          <w:iCs/>
+          <w:i/>
+        </w:rPr>
+        <w:t xml:space="preserve">might</w:t>
+      </w:r>
+      <w:r>
+        <w:t xml:space="preserve"> </w:t>
+      </w:r>
+      <w:r>
+        <w:t xml:space="preserve">be one. It’s now up to us to prove that there</w:t>
+      </w:r>
+      <w:r>
+        <w:t xml:space="preserve"> </w:t>
+      </w:r>
+      <w:r>
+        <w:rPr>
+          <w:iCs/>
+          <w:i/>
+        </w:rPr>
+        <w:t xml:space="preserve">isn’t</w:t>
+      </w:r>
+      <w:r>
+        <w:t xml:space="preserve"> </w:t>
+      </w:r>
+      <w:r>
+        <w:t xml:space="preserve">a problem.</w:t>
+      </w:r>
+    </w:p>
+    <w:p>
+      <w:pPr>
+        <w:pStyle w:val="BodyText"/>
+      </w:pPr>
+      <w:r>
+        <w:t xml:space="preserve">There are many descriptive techniques to check for anomalies in our data, but a convenient</w:t>
       </w:r>
       <w:r>
         <w:t xml:space="preserve"> </w:t>
@@ -3796,7 +4403,7 @@
         <w:t xml:space="preserve">“</w:t>
       </w:r>
       <w:r>
-        <w:t xml:space="preserve">normal</w:t>
+        <w:t xml:space="preserve">short cut</w:t>
       </w:r>
       <w:r>
         <w:t xml:space="preserve">”</w:t>
@@ -3805,133 +4412,37 @@
         <w:t xml:space="preserve"> </w:t>
       </w:r>
       <w:r>
-        <w:t xml:space="preserve">is; hence why it’s a good idea to have some sort of notion of what a</w:t>
-      </w:r>
-      <w:r>
-        <w:t xml:space="preserve"> </w:t>
-      </w:r>
-      <w:r>
-        <w:t xml:space="preserve">“</w:t>
-      </w:r>
-      <w:r>
-        <w:t xml:space="preserve">normal</w:t>
-      </w:r>
-      <w:r>
-        <w:t xml:space="preserve">”</w:t>
-      </w:r>
-      <w:r>
-        <w:t xml:space="preserve"> </w:t>
-      </w:r>
-      <w:r>
-        <w:t xml:space="preserve">alligator’s bite strength and length may be.</w:t>
-      </w:r>
-    </w:p>
-    <w:p>
-      <w:pPr>
-        <w:pStyle w:val="BodyText"/>
-      </w:pPr>
-      <w:r>
-        <w:t xml:space="preserve">Write down the average bite strength of an alligator, measured in pounds per square inch, and the average length of an alligator in centimeters (ideally as a comment in your script).</w:t>
-      </w:r>
-    </w:p>
-    <w:p>
-      <w:pPr>
-        <w:pStyle w:val="BodyText"/>
-      </w:pPr>
-      <w:r>
-        <w:t xml:space="preserve">With that done, let’s move on to understanding our data. For starters, let’s check if the data is sensibly structured. In</w:t>
-      </w:r>
-      <w:r>
-        <w:t xml:space="preserve"> </w:t>
-      </w:r>
-      <w:r>
-        <w:rPr>
-          <w:rStyle w:val="VerbatimChar"/>
-        </w:rPr>
-        <w:t xml:space="preserve">R</w:t>
-      </w:r>
-      <w:r>
-        <w:t xml:space="preserve">, this means that numbers are numbers, words are characters (or sometimes factors), and so on. Basically, we want to make sure there aren’t any bite measurements like</w:t>
-      </w:r>
-      <w:r>
-        <w:t xml:space="preserve"> </w:t>
-      </w:r>
-      <w:r>
-        <w:rPr>
-          <w:rStyle w:val="VerbatimChar"/>
-        </w:rPr>
-        <w:t xml:space="preserve">2174.94BIGBITE</w:t>
-      </w:r>
-      <w:r>
-        <w:t xml:space="preserve">, which would mess us up by causing</w:t>
-      </w:r>
-      <w:r>
-        <w:t xml:space="preserve"> </w:t>
-      </w:r>
-      <w:r>
-        <w:rPr>
-          <w:rStyle w:val="VerbatimChar"/>
-        </w:rPr>
-        <w:t xml:space="preserve">R</w:t>
-      </w:r>
-      <w:r>
-        <w:t xml:space="preserve"> </w:t>
-      </w:r>
-      <w:r>
-        <w:t xml:space="preserve">to think that all</w:t>
-      </w:r>
-      <w:r>
-        <w:t xml:space="preserve"> </w:t>
-      </w:r>
-      <w:r>
-        <w:rPr>
-          <w:rStyle w:val="VerbatimChar"/>
-        </w:rPr>
-        <w:t xml:space="preserve">bite</w:t>
-      </w:r>
-      <w:r>
-        <w:t xml:space="preserve"> </w:t>
-      </w:r>
-      <w:r>
-        <w:t xml:space="preserve">values are characters and not numbers.</w:t>
-      </w:r>
-    </w:p>
-    <w:p>
-      <w:pPr>
-        <w:pStyle w:val="BodyText"/>
-      </w:pPr>
-      <w:r>
-        <w:t xml:space="preserve">To do this quickly, we can use the</w:t>
-      </w:r>
-      <w:r>
-        <w:t xml:space="preserve"> </w:t>
-      </w:r>
-      <w:r>
-        <w:rPr>
-          <w:rStyle w:val="VerbatimChar"/>
-        </w:rPr>
-        <w:t xml:space="preserve">str()</w:t>
-      </w:r>
-      <w:r>
-        <w:t xml:space="preserve"> </w:t>
-      </w:r>
-      <w:r>
-        <w:t xml:space="preserve">function (short for</w:t>
-      </w:r>
-      <w:r>
-        <w:t xml:space="preserve"> </w:t>
-      </w:r>
-      <w:r>
-        <w:t xml:space="preserve">“</w:t>
-      </w:r>
-      <w:r>
-        <w:t xml:space="preserve">structure</w:t>
-      </w:r>
-      <w:r>
-        <w:t xml:space="preserve">”</w:t>
-      </w:r>
-      <w:r>
-        <w:t xml:space="preserve">):</w:t>
+        <w:t xml:space="preserve">is to use the</w:t>
+      </w:r>
+      <w:r>
+        <w:t xml:space="preserve"> </w:t>
+      </w:r>
+      <w:r>
+        <w:rPr>
+          <w:rStyle w:val="VerbatimChar"/>
+        </w:rPr>
+        <w:t xml:space="preserve">summary()</w:t>
+      </w:r>
+      <w:r>
+        <w:t xml:space="preserve"> </w:t>
+      </w:r>
+      <w:r>
+        <w:t xml:space="preserve">function. This function provides a generic summary of our entire dataset when we supply</w:t>
+      </w:r>
+      <w:r>
+        <w:t xml:space="preserve"> </w:t>
+      </w:r>
+      <w:r>
+        <w:rPr>
+          <w:rStyle w:val="VerbatimChar"/>
+        </w:rPr>
+        <w:t xml:space="preserve">ali</w:t>
+      </w:r>
+      <w:r>
+        <w:t xml:space="preserve"> </w:t>
+      </w:r>
+      <w:r>
+        <w:t xml:space="preserve">as the sole argument. Try this now and see if you can identify any issues with the data.</w:t>
       </w:r>
     </w:p>
     <w:p>
@@ -3942,7 +4453,7 @@
         <w:rPr>
           <w:rStyle w:val="FunctionTok"/>
         </w:rPr>
-        <w:t xml:space="preserve">str</w:t>
+        <w:t xml:space="preserve">summary</w:t>
       </w:r>
       <w:r>
         <w:rPr>
@@ -3956,526 +4467,15 @@
         <w:pStyle w:val="FirstParagraph"/>
       </w:pPr>
       <w:r>
-        <w:t xml:space="preserve">We see that</w:t>
-      </w:r>
-      <w:r>
-        <w:t xml:space="preserve"> </w:t>
-      </w:r>
-      <w:r>
-        <w:rPr>
-          <w:rStyle w:val="VerbatimChar"/>
-        </w:rPr>
-        <w:t xml:space="preserve">ali</w:t>
-      </w:r>
-      <w:r>
-        <w:t xml:space="preserve"> </w:t>
-      </w:r>
-      <w:r>
-        <w:t xml:space="preserve">is a</w:t>
-      </w:r>
-      <w:r>
-        <w:t xml:space="preserve"> </w:t>
-      </w:r>
-      <w:r>
-        <w:rPr>
-          <w:rStyle w:val="VerbatimChar"/>
-        </w:rPr>
-        <w:t xml:space="preserve">data.frame</w:t>
-      </w:r>
-      <w:r>
-        <w:t xml:space="preserve"> </w:t>
-      </w:r>
-      <w:r>
-        <w:t xml:space="preserve">(great - it should be!), with 78 observations (or samples) and two variables. The</w:t>
-      </w:r>
-      <w:r>
-        <w:t xml:space="preserve"> </w:t>
-      </w:r>
-      <w:r>
-        <w:rPr>
-          <w:rStyle w:val="VerbatimChar"/>
-        </w:rPr>
-        <w:t xml:space="preserve">$</w:t>
-      </w:r>
-      <w:r>
-        <w:t xml:space="preserve"> </w:t>
-      </w:r>
-      <w:r>
-        <w:t xml:space="preserve">operator is used to extract specific variables from a dataframe, so</w:t>
-      </w:r>
-      <w:r>
-        <w:t xml:space="preserve"> </w:t>
-      </w:r>
-      <w:r>
-        <w:rPr>
-          <w:rStyle w:val="VerbatimChar"/>
-        </w:rPr>
-        <w:t xml:space="preserve">ali$bite</w:t>
-      </w:r>
-      <w:r>
-        <w:t xml:space="preserve"> </w:t>
-      </w:r>
-      <w:r>
-        <w:t xml:space="preserve">will give you just the</w:t>
-      </w:r>
-      <w:r>
-        <w:t xml:space="preserve"> </w:t>
-      </w:r>
-      <w:r>
-        <w:rPr>
-          <w:rStyle w:val="VerbatimChar"/>
-        </w:rPr>
-        <w:t xml:space="preserve">bite</w:t>
-      </w:r>
-      <w:r>
-        <w:t xml:space="preserve"> </w:t>
-      </w:r>
-      <w:r>
-        <w:t xml:space="preserve">variable from the</w:t>
-      </w:r>
-      <w:r>
-        <w:t xml:space="preserve"> </w:t>
-      </w:r>
-      <w:r>
-        <w:rPr>
-          <w:rStyle w:val="VerbatimChar"/>
-        </w:rPr>
-        <w:t xml:space="preserve">ali</w:t>
-      </w:r>
-      <w:r>
-        <w:t xml:space="preserve"> </w:t>
-      </w:r>
-      <w:r>
-        <w:t xml:space="preserve">dataset. This is why the second and third lines are preceded by</w:t>
-      </w:r>
-      <w:r>
-        <w:t xml:space="preserve"> </w:t>
-      </w:r>
-      <w:r>
-        <w:rPr>
-          <w:rStyle w:val="VerbatimChar"/>
-        </w:rPr>
-        <w:t xml:space="preserve">$</w:t>
-      </w:r>
-      <w:r>
-        <w:t xml:space="preserve">. From this, we can see that both the</w:t>
-      </w:r>
-      <w:r>
-        <w:t xml:space="preserve"> </w:t>
-      </w:r>
-      <w:r>
-        <w:rPr>
-          <w:rStyle w:val="VerbatimChar"/>
-        </w:rPr>
-        <w:t xml:space="preserve">length</w:t>
-      </w:r>
-      <w:r>
-        <w:t xml:space="preserve"> </w:t>
-      </w:r>
-      <w:r>
-        <w:t xml:space="preserve">and</w:t>
-      </w:r>
-      <w:r>
-        <w:t xml:space="preserve"> </w:t>
-      </w:r>
-      <w:r>
-        <w:rPr>
-          <w:rStyle w:val="VerbatimChar"/>
-        </w:rPr>
-        <w:t xml:space="preserve">bite</w:t>
-      </w:r>
-      <w:r>
-        <w:t xml:space="preserve"> </w:t>
-      </w:r>
-      <w:r>
-        <w:t xml:space="preserve">variables are being treated as numbers (indicated by</w:t>
-      </w:r>
-      <w:r>
-        <w:t xml:space="preserve"> </w:t>
-      </w:r>
-      <w:r>
-        <w:rPr>
-          <w:rStyle w:val="VerbatimChar"/>
-        </w:rPr>
-        <w:t xml:space="preserve">num</w:t>
-      </w:r>
-      <w:r>
-        <w:t xml:space="preserve">), and we get a handful of example values for both</w:t>
-      </w:r>
-      <w:r>
-        <w:t xml:space="preserve"> </w:t>
-      </w:r>
-      <w:r>
-        <w:rPr>
-          <w:rStyle w:val="VerbatimChar"/>
-        </w:rPr>
-        <w:t xml:space="preserve">length</w:t>
-      </w:r>
-      <w:r>
-        <w:t xml:space="preserve"> </w:t>
-      </w:r>
-      <w:r>
-        <w:t xml:space="preserve">and</w:t>
-      </w:r>
-      <w:r>
-        <w:t xml:space="preserve"> </w:t>
-      </w:r>
-      <w:r>
-        <w:rPr>
-          <w:rStyle w:val="VerbatimChar"/>
-        </w:rPr>
-        <w:t xml:space="preserve">bite</w:t>
-      </w:r>
-      <w:r>
-        <w:t xml:space="preserve">.</w:t>
-      </w:r>
-    </w:p>
-    <w:p>
-      <w:pPr>
-        <w:pStyle w:val="BodyText"/>
-      </w:pPr>
-      <w:r>
-        <w:t xml:space="preserve">So far, we’re not seeing anything unusual, which is great - it means we haven’t identified any problems that we need to fix.</w:t>
-      </w:r>
-    </w:p>
-    <w:p>
-      <w:pPr>
-        <w:pStyle w:val="BodyText"/>
-      </w:pPr>
-      <w:r>
-        <w:t xml:space="preserve">If we wanted to, we could extract the</w:t>
-      </w:r>
-      <w:r>
-        <w:t xml:space="preserve"> </w:t>
-      </w:r>
-      <w:r>
-        <w:rPr>
-          <w:rStyle w:val="VerbatimChar"/>
-        </w:rPr>
-        <w:t xml:space="preserve">length</w:t>
-      </w:r>
-      <w:r>
-        <w:t xml:space="preserve"> </w:t>
-      </w:r>
-      <w:r>
-        <w:t xml:space="preserve">variable from the dataset by doing:</w:t>
-      </w:r>
-    </w:p>
-    <w:p>
-      <w:pPr>
-        <w:pStyle w:val="SourceCode"/>
-      </w:pPr>
-      <w:r>
-        <w:rPr>
-          <w:rStyle w:val="NormalTok"/>
-        </w:rPr>
-        <w:t xml:space="preserve">ali</w:t>
-      </w:r>
-      <w:r>
-        <w:rPr>
-          <w:rStyle w:val="SpecialCharTok"/>
-        </w:rPr>
-        <w:t xml:space="preserve">$</w:t>
-      </w:r>
-      <w:r>
-        <w:rPr>
-          <w:rStyle w:val="NormalTok"/>
-        </w:rPr>
-        <w:t xml:space="preserve">length</w:t>
-      </w:r>
-    </w:p>
-    <w:p>
-      <w:pPr>
-        <w:pStyle w:val="FirstParagraph"/>
-      </w:pPr>
-      <w:r>
-        <w:t xml:space="preserve">How would you extract the</w:t>
-      </w:r>
-      <w:r>
-        <w:t xml:space="preserve"> </w:t>
-      </w:r>
-      <w:r>
-        <w:rPr>
-          <w:rStyle w:val="VerbatimChar"/>
-        </w:rPr>
-        <w:t xml:space="preserve">bite</w:t>
-      </w:r>
-      <w:r>
-        <w:t xml:space="preserve"> </w:t>
-      </w:r>
-      <w:r>
-        <w:t xml:space="preserve">variable?</w:t>
-      </w:r>
-    </w:p>
-    <w:p>
-      <w:pPr>
-        <w:pStyle w:val="BodyText"/>
-      </w:pPr>
-      <w:r>
-        <w:t xml:space="preserve">Let’s use these extracted variables to calculate some summary statistics, starting with the mean (i.e. average). To do so, we use the</w:t>
-      </w:r>
-      <w:r>
-        <w:t xml:space="preserve"> </w:t>
-      </w:r>
-      <w:r>
-        <w:rPr>
-          <w:rStyle w:val="VerbatimChar"/>
-        </w:rPr>
-        <w:t xml:space="preserve">mean()</w:t>
-      </w:r>
-      <w:r>
-        <w:t xml:space="preserve"> </w:t>
-      </w:r>
-      <w:r>
-        <w:t xml:space="preserve">function. To find the average length of our alligators, we do:</w:t>
-      </w:r>
-    </w:p>
-    <w:p>
-      <w:pPr>
-        <w:pStyle w:val="SourceCode"/>
-      </w:pPr>
-      <w:r>
-        <w:rPr>
-          <w:rStyle w:val="FunctionTok"/>
-        </w:rPr>
-        <w:t xml:space="preserve">mean</w:t>
-      </w:r>
-      <w:r>
-        <w:rPr>
-          <w:rStyle w:val="NormalTok"/>
-        </w:rPr>
-        <w:t xml:space="preserve">(ali</w:t>
-      </w:r>
-      <w:r>
-        <w:rPr>
-          <w:rStyle w:val="SpecialCharTok"/>
-        </w:rPr>
-        <w:t xml:space="preserve">$</w:t>
-      </w:r>
-      <w:r>
-        <w:rPr>
-          <w:rStyle w:val="NormalTok"/>
-        </w:rPr>
-        <w:t xml:space="preserve">length)</w:t>
-      </w:r>
-    </w:p>
-    <w:p>
-      <w:pPr>
-        <w:pStyle w:val="FirstParagraph"/>
-      </w:pPr>
-      <w:r>
-        <w:t xml:space="preserve">We can see that the average alligator in Parker Island Gator Farm is 374 cm long.</w:t>
-      </w:r>
-    </w:p>
-    <w:p>
-      <w:pPr>
-        <w:pStyle w:val="BodyText"/>
-      </w:pPr>
-      <w:r>
-        <w:t xml:space="preserve">Compare this value with the mean length of alligators you found from a quick internet search. It might be a bit longer than expected, but this could be due to these alligators coming from a farm rather than the wild. Perhaps they’re given lots of food to help them grow? While our numbers may not match exactly with online data, significant discrepancies could be worth investigating.</w:t>
-      </w:r>
-    </w:p>
-    <w:p>
-      <w:pPr>
-        <w:pStyle w:val="BodyText"/>
-      </w:pPr>
-      <w:r>
-        <w:t xml:space="preserve">Similarly, calculate the average bite strength of our alligators and see if there’s anything unusual there.</w:t>
-      </w:r>
-    </w:p>
-    <w:p>
-      <w:pPr>
-        <w:pStyle w:val="SourceCode"/>
-      </w:pPr>
-      <w:r>
-        <w:rPr>
-          <w:rStyle w:val="FunctionTok"/>
-        </w:rPr>
-        <w:t xml:space="preserve">mean</w:t>
-      </w:r>
-      <w:r>
-        <w:rPr>
-          <w:rStyle w:val="NormalTok"/>
-        </w:rPr>
-        <w:t xml:space="preserve">(ali</w:t>
-      </w:r>
-      <w:r>
-        <w:rPr>
-          <w:rStyle w:val="SpecialCharTok"/>
-        </w:rPr>
-        <w:t xml:space="preserve">$</w:t>
-      </w:r>
-      <w:r>
-        <w:rPr>
-          <w:rStyle w:val="NormalTok"/>
-        </w:rPr>
-        <w:t xml:space="preserve">bite)</w:t>
-      </w:r>
-    </w:p>
-    <w:p>
-      <w:pPr>
-        <w:pStyle w:val="FirstParagraph"/>
-      </w:pPr>
-      <w:r>
-        <w:t xml:space="preserve">Assuming you found that alligator bite strength is roughly 2,000 pounds per square inch, our alligators appear to be biting with an extra 1,500 pounds per square inch</w:t>
-      </w:r>
-      <w:r>
-        <w:t xml:space="preserve"> </w:t>
-      </w:r>
-      <w:r>
-        <w:rPr>
+        <w:t xml:space="preserve">Keep in mind, with EDA we’re looking for anything</w:t>
+      </w:r>
+      <w:r>
+        <w:t xml:space="preserve"> </w:t>
+      </w:r>
+      <w:r>
+        <w:rPr>
+          <w:iCs/>
           <w:i/>
-          <w:iCs/>
-        </w:rPr>
-        <w:t xml:space="preserve">on average</w:t>
-      </w:r>
-      <w:r>
-        <w:t xml:space="preserve">. That seems like</w:t>
-      </w:r>
-      <w:r>
-        <w:t xml:space="preserve"> </w:t>
-      </w:r>
-      <w:r>
-        <w:rPr>
-          <w:i/>
-          <w:iCs/>
-        </w:rPr>
-        <w:t xml:space="preserve">a lot</w:t>
-      </w:r>
-      <w:r>
-        <w:t xml:space="preserve"> </w:t>
-      </w:r>
-      <w:r>
-        <w:t xml:space="preserve">more.</w:t>
-      </w:r>
-    </w:p>
-    <w:p>
-      <w:pPr>
-        <w:pStyle w:val="BodyText"/>
-      </w:pPr>
-      <w:r>
-        <w:t xml:space="preserve">This is something that should make us sit up and pay attention. We don’t know for sure if there’s a problem, but we have reason to believe there</w:t>
-      </w:r>
-      <w:r>
-        <w:t xml:space="preserve"> </w:t>
-      </w:r>
-      <w:r>
-        <w:rPr>
-          <w:i/>
-          <w:iCs/>
-        </w:rPr>
-        <w:t xml:space="preserve">might</w:t>
-      </w:r>
-      <w:r>
-        <w:t xml:space="preserve"> </w:t>
-      </w:r>
-      <w:r>
-        <w:t xml:space="preserve">be one. It’s now up to us to prove that there</w:t>
-      </w:r>
-      <w:r>
-        <w:t xml:space="preserve"> </w:t>
-      </w:r>
-      <w:r>
-        <w:rPr>
-          <w:i/>
-          <w:iCs/>
-        </w:rPr>
-        <w:t xml:space="preserve">isn’t</w:t>
-      </w:r>
-      <w:r>
-        <w:t xml:space="preserve"> </w:t>
-      </w:r>
-      <w:r>
-        <w:t xml:space="preserve">a problem.</w:t>
-      </w:r>
-    </w:p>
-    <w:p>
-      <w:pPr>
-        <w:pStyle w:val="BodyText"/>
-      </w:pPr>
-      <w:r>
-        <w:t xml:space="preserve">There are many descriptive techniques to check for anomalies in our data, but a convenient</w:t>
-      </w:r>
-      <w:r>
-        <w:t xml:space="preserve"> </w:t>
-      </w:r>
-      <w:r>
-        <w:t xml:space="preserve">“</w:t>
-      </w:r>
-      <w:r>
-        <w:t xml:space="preserve">short cut</w:t>
-      </w:r>
-      <w:r>
-        <w:t xml:space="preserve">”</w:t>
-      </w:r>
-      <w:r>
-        <w:t xml:space="preserve"> </w:t>
-      </w:r>
-      <w:r>
-        <w:t xml:space="preserve">is to use the</w:t>
-      </w:r>
-      <w:r>
-        <w:t xml:space="preserve"> </w:t>
-      </w:r>
-      <w:r>
-        <w:rPr>
-          <w:rStyle w:val="VerbatimChar"/>
-        </w:rPr>
-        <w:t xml:space="preserve">summary()</w:t>
-      </w:r>
-      <w:r>
-        <w:t xml:space="preserve"> </w:t>
-      </w:r>
-      <w:r>
-        <w:t xml:space="preserve">function. This function provides a generic summary of our entire dataset when we supply</w:t>
-      </w:r>
-      <w:r>
-        <w:t xml:space="preserve"> </w:t>
-      </w:r>
-      <w:r>
-        <w:rPr>
-          <w:rStyle w:val="VerbatimChar"/>
-        </w:rPr>
-        <w:t xml:space="preserve">ali</w:t>
-      </w:r>
-      <w:r>
-        <w:t xml:space="preserve"> </w:t>
-      </w:r>
-      <w:r>
-        <w:t xml:space="preserve">as the sole argument. Try this now and see if you can identify any issues with the data.</w:t>
-      </w:r>
-    </w:p>
-    <w:p>
-      <w:pPr>
-        <w:pStyle w:val="SourceCode"/>
-      </w:pPr>
-      <w:r>
-        <w:rPr>
-          <w:rStyle w:val="FunctionTok"/>
-        </w:rPr>
-        <w:t xml:space="preserve">summary</w:t>
-      </w:r>
-      <w:r>
-        <w:rPr>
-          <w:rStyle w:val="NormalTok"/>
-        </w:rPr>
-        <w:t xml:space="preserve">(ali)</w:t>
-      </w:r>
-    </w:p>
-    <w:p>
-      <w:pPr>
-        <w:pStyle w:val="FirstParagraph"/>
-      </w:pPr>
-      <w:r>
-        <w:t xml:space="preserve">Keep in mind, with EDA we’re looking for anything</w:t>
-      </w:r>
-      <w:r>
-        <w:t xml:space="preserve"> </w:t>
-      </w:r>
-      <w:r>
-        <w:rPr>
-          <w:i/>
-          <w:iCs/>
         </w:rPr>
         <w:t xml:space="preserve">weird</w:t>
       </w:r>
@@ -4647,11 +4647,11 @@
     </w:p>
     <w:p>
       <w:pPr>
-        <w:pStyle w:val="Compact"/>
         <w:numPr>
           <w:ilvl w:val="0"/>
           <w:numId w:val="1008"/>
         </w:numPr>
+        <w:pStyle w:val="Compact"/>
       </w:pPr>
       <w:r>
         <w:t xml:space="preserve">We’d start by looking at the</w:t>
@@ -4674,11 +4674,11 @@
     </w:p>
     <w:p>
       <w:pPr>
-        <w:pStyle w:val="Compact"/>
         <w:numPr>
           <w:ilvl w:val="0"/>
           <w:numId w:val="1008"/>
         </w:numPr>
+        <w:pStyle w:val="Compact"/>
       </w:pPr>
       <w:r>
         <w:t xml:space="preserve">We’d then skim through the</w:t>
@@ -4701,11 +4701,11 @@
     </w:p>
     <w:p>
       <w:pPr>
-        <w:pStyle w:val="Compact"/>
         <w:numPr>
           <w:ilvl w:val="0"/>
           <w:numId w:val="1008"/>
         </w:numPr>
+        <w:pStyle w:val="Compact"/>
       </w:pPr>
       <w:r>
         <w:t xml:space="preserve">Once we’ve found these rows, examine all the information related to those alligators.</w:t>
@@ -4733,11 +4733,11 @@
     </w:p>
     <w:p>
       <w:pPr>
-        <w:pStyle w:val="Compact"/>
         <w:numPr>
           <w:ilvl w:val="0"/>
           <w:numId w:val="1009"/>
         </w:numPr>
+        <w:pStyle w:val="Compact"/>
       </w:pPr>
       <w:r>
         <w:t xml:space="preserve">We’d start by looking at the</w:t>
@@ -4771,11 +4771,11 @@
     </w:p>
     <w:p>
       <w:pPr>
-        <w:pStyle w:val="Compact"/>
         <w:numPr>
           <w:ilvl w:val="0"/>
           <w:numId w:val="1010"/>
         </w:numPr>
+        <w:pStyle w:val="Compact"/>
       </w:pPr>
       <w:r>
         <w:t xml:space="preserve">We’d then skim through the</w:t>
@@ -4832,8 +4832,8 @@
       </w:r>
       <w:r>
         <w:rPr>
+          <w:iCs/>
           <w:i/>
-          <w:iCs/>
         </w:rPr>
         <w:t xml:space="preserve">something</w:t>
       </w:r>
@@ -5053,11 +5053,11 @@
     </w:p>
     <w:p>
       <w:pPr>
-        <w:pStyle w:val="Compact"/>
         <w:numPr>
           <w:ilvl w:val="0"/>
           <w:numId w:val="1011"/>
         </w:numPr>
+        <w:pStyle w:val="Compact"/>
       </w:pPr>
       <w:r>
         <w:t xml:space="preserve">Once we’ve found these rows, examine all the information related to those alligators.</w:t>
@@ -6147,24 +6147,24 @@
       </w:r>
       <w:r>
         <w:rPr>
+          <w:iCs/>
           <w:i/>
+        </w:rPr>
+        <w:t xml:space="preserve">less than or equal to</w:t>
+      </w:r>
+      <w:r>
+        <w:t xml:space="preserve"> </w:t>
+      </w:r>
+      <w:r>
+        <w:t xml:space="preserve">the 33% quantile. If you’re unsure how to specify</w:t>
+      </w:r>
+      <w:r>
+        <w:t xml:space="preserve"> </w:t>
+      </w:r>
+      <w:r>
+        <w:rPr>
           <w:iCs/>
-        </w:rPr>
-        <w:t xml:space="preserve">less than or equal to</w:t>
-      </w:r>
-      <w:r>
-        <w:t xml:space="preserve"> </w:t>
-      </w:r>
-      <w:r>
-        <w:t xml:space="preserve">the 33% quantile. If you’re unsure how to specify</w:t>
-      </w:r>
-      <w:r>
-        <w:t xml:space="preserve"> </w:t>
-      </w:r>
-      <w:r>
-        <w:rPr>
           <w:i/>
-          <w:iCs/>
         </w:rPr>
         <w:t xml:space="preserve">less than or equal to</w:t>
       </w:r>
@@ -6208,8 +6208,8 @@
         <w:r>
           <w:rPr>
             <w:rStyle w:val="Hyperlink"/>
+            <w:iCs/>
             <w:i/>
-            <w:iCs/>
           </w:rPr>
           <w:t xml:space="preserve">Sarcosuchus</w:t>
         </w:r>
@@ -6225,8 +6225,8 @@
       </w:r>
       <w:r>
         <w:rPr>
+          <w:iCs/>
           <w:i/>
-          <w:iCs/>
         </w:rPr>
         <w:t xml:space="preserve">Sarcosuchus</w:t>
       </w:r>
@@ -6266,8 +6266,8 @@
       </w:r>
       <w:r>
         <w:rPr>
+          <w:iCs/>
           <w:i/>
-          <w:iCs/>
         </w:rPr>
         <w:t xml:space="preserve">fake</w:t>
       </w:r>
@@ -6417,45 +6417,45 @@
       </w:r>
       <w:r>
         <w:rPr>
+          <w:iCs/>
           <w:i/>
+        </w:rPr>
+        <w:t xml:space="preserve">strongly</w:t>
+      </w:r>
+      <w:r>
+        <w:t xml:space="preserve"> </w:t>
+      </w:r>
+      <w:r>
+        <w:t xml:space="preserve">recommend doing this in</w:t>
+      </w:r>
+      <w:r>
+        <w:t xml:space="preserve"> </w:t>
+      </w:r>
+      <w:r>
+        <w:rPr>
+          <w:rStyle w:val="VerbatimChar"/>
+        </w:rPr>
+        <w:t xml:space="preserve">R</w:t>
+      </w:r>
+      <w:r>
+        <w:t xml:space="preserve">. Doing so makes our change clear and transparent - the change is right there in the code for all to see. Doing it in Excel means that we’re kind of obscuring it, or at least we’d have to say</w:t>
+      </w:r>
+      <w:r>
+        <w:t xml:space="preserve"> </w:t>
+      </w:r>
+      <w:r>
+        <w:t xml:space="preserve">“</w:t>
+      </w:r>
+      <w:r>
+        <w:t xml:space="preserve">We had this weird observation, but we’ve totally sorted it out. Don’t worry.</w:t>
+      </w:r>
+      <w:r>
+        <w:t xml:space="preserve"> </w:t>
+      </w:r>
+      <w:r>
+        <w:rPr>
           <w:iCs/>
-        </w:rPr>
-        <w:t xml:space="preserve">strongly</w:t>
-      </w:r>
-      <w:r>
-        <w:t xml:space="preserve"> </w:t>
-      </w:r>
-      <w:r>
-        <w:t xml:space="preserve">recommend doing this in</w:t>
-      </w:r>
-      <w:r>
-        <w:t xml:space="preserve"> </w:t>
-      </w:r>
-      <w:r>
-        <w:rPr>
-          <w:rStyle w:val="VerbatimChar"/>
-        </w:rPr>
-        <w:t xml:space="preserve">R</w:t>
-      </w:r>
-      <w:r>
-        <w:t xml:space="preserve">. Doing so makes our change clear and transparent - the change is right there in the code for all to see. Doing it in Excel means that we’re kind of obscuring it, or at least we’d have to say</w:t>
-      </w:r>
-      <w:r>
-        <w:t xml:space="preserve"> </w:t>
-      </w:r>
-      <w:r>
-        <w:t xml:space="preserve">“</w:t>
-      </w:r>
-      <w:r>
-        <w:t xml:space="preserve">We had this weird observation, but we’ve totally sorted it out. Don’t worry.</w:t>
-      </w:r>
-      <w:r>
-        <w:t xml:space="preserve"> </w:t>
-      </w:r>
-      <w:r>
-        <w:rPr>
           <w:i/>
-          <w:iCs/>
         </w:rPr>
         <w:t xml:space="preserve">Trust us.</w:t>
       </w:r>
@@ -6989,8 +6989,8 @@
       </w:r>
       <w:r>
         <w:rPr>
+          <w:iCs/>
           <w:i/>
-          <w:iCs/>
         </w:rPr>
         <w:t xml:space="preserve">weird</w:t>
       </w:r>
@@ -7125,6 +7125,442 @@
     </w:p>
     <w:bookmarkEnd w:id="51"/>
     <w:bookmarkEnd w:id="52"/>
+    <w:bookmarkStart w:id="55" w:name="chupacabras-aliens-and-beer"/>
+    <w:p>
+      <w:pPr>
+        <w:pStyle w:val="Heading1"/>
+      </w:pPr>
+      <w:r>
+        <w:t xml:space="preserve">Chupacabras, Aliens and Beer</w:t>
+      </w:r>
+    </w:p>
+    <w:p>
+      <w:pPr>
+        <w:pStyle w:val="FirstParagraph"/>
+      </w:pPr>
+      <w:r>
+        <w:t xml:space="preserve">The final dataset you will be working with is called</w:t>
+      </w:r>
+      <w:r>
+        <w:t xml:space="preserve"> </w:t>
+      </w:r>
+      <w:r>
+        <w:rPr>
+          <w:rStyle w:val="VerbatimChar"/>
+        </w:rPr>
+        <w:t xml:space="preserve">chupa.txt</w:t>
+      </w:r>
+      <w:r>
+        <w:t xml:space="preserve">. We will work on this together in the final 30 minutes of the session but if you are finished early and want to get started, please feel free to do so. This dataset contains the following variables:</w:t>
+      </w:r>
+    </w:p>
+    <w:p>
+      <w:pPr>
+        <w:numPr>
+          <w:ilvl w:val="0"/>
+          <w:numId w:val="1014"/>
+        </w:numPr>
+      </w:pPr>
+      <w:r>
+        <w:rPr>
+          <w:rStyle w:val="VerbatimChar"/>
+        </w:rPr>
+        <w:t xml:space="preserve">year</w:t>
+      </w:r>
+      <w:r>
+        <w:t xml:space="preserve">: The year in which data was collected</w:t>
+      </w:r>
+    </w:p>
+    <w:p>
+      <w:pPr>
+        <w:numPr>
+          <w:ilvl w:val="0"/>
+          <w:numId w:val="1014"/>
+        </w:numPr>
+      </w:pPr>
+      <w:r>
+        <w:rPr>
+          <w:rStyle w:val="VerbatimChar"/>
+        </w:rPr>
+        <w:t xml:space="preserve">city</w:t>
+      </w:r>
+      <w:r>
+        <w:t xml:space="preserve">: The city where the data was collected</w:t>
+      </w:r>
+    </w:p>
+    <w:p>
+      <w:pPr>
+        <w:numPr>
+          <w:ilvl w:val="0"/>
+          <w:numId w:val="1014"/>
+        </w:numPr>
+      </w:pPr>
+      <w:r>
+        <w:rPr>
+          <w:rStyle w:val="VerbatimChar"/>
+        </w:rPr>
+        <w:t xml:space="preserve">alc</w:t>
+      </w:r>
+      <w:r>
+        <w:t xml:space="preserve">: The average alcohol consumption in that city, in that year</w:t>
+      </w:r>
+    </w:p>
+    <w:p>
+      <w:pPr>
+        <w:numPr>
+          <w:ilvl w:val="0"/>
+          <w:numId w:val="1014"/>
+        </w:numPr>
+      </w:pPr>
+      <w:r>
+        <w:rPr>
+          <w:rStyle w:val="VerbatimChar"/>
+        </w:rPr>
+        <w:t xml:space="preserve">ufo</w:t>
+      </w:r>
+      <w:r>
+        <w:t xml:space="preserve">: The number of</w:t>
+      </w:r>
+      <w:r>
+        <w:t xml:space="preserve"> </w:t>
+      </w:r>
+      <w:hyperlink r:id="rId53">
+        <w:r>
+          <w:rPr>
+            <w:rStyle w:val="Hyperlink"/>
+          </w:rPr>
+          <w:t xml:space="preserve">unidentified flying objects</w:t>
+        </w:r>
+      </w:hyperlink>
+      <w:r>
+        <w:t xml:space="preserve"> </w:t>
+      </w:r>
+      <w:r>
+        <w:t xml:space="preserve">(i.e. aliens) reported in that city, in that year</w:t>
+      </w:r>
+    </w:p>
+    <w:p>
+      <w:pPr>
+        <w:numPr>
+          <w:ilvl w:val="0"/>
+          <w:numId w:val="1014"/>
+        </w:numPr>
+      </w:pPr>
+      <w:r>
+        <w:rPr>
+          <w:rStyle w:val="VerbatimChar"/>
+        </w:rPr>
+        <w:t xml:space="preserve">belief</w:t>
+      </w:r>
+      <w:r>
+        <w:t xml:space="preserve">: The most common response from a selection of members of the public when asked if they believe in the supernatural, in that city, in that year</w:t>
+      </w:r>
+    </w:p>
+    <w:p>
+      <w:pPr>
+        <w:numPr>
+          <w:ilvl w:val="0"/>
+          <w:numId w:val="1014"/>
+        </w:numPr>
+      </w:pPr>
+      <w:r>
+        <w:rPr>
+          <w:rStyle w:val="VerbatimChar"/>
+        </w:rPr>
+        <w:t xml:space="preserve">chupa</w:t>
+      </w:r>
+      <w:r>
+        <w:t xml:space="preserve">: The growth rate of</w:t>
+      </w:r>
+      <w:r>
+        <w:t xml:space="preserve"> </w:t>
+      </w:r>
+      <w:hyperlink r:id="rId54">
+        <w:r>
+          <w:rPr>
+            <w:rStyle w:val="Hyperlink"/>
+          </w:rPr>
+          <w:t xml:space="preserve">chupacabra</w:t>
+        </w:r>
+      </w:hyperlink>
+      <w:r>
+        <w:t xml:space="preserve"> </w:t>
+      </w:r>
+      <w:r>
+        <w:t xml:space="preserve">sightings from the previous year to the current year, in that city (where a value of zero means the number of sightings is constant, -0.5 means the number of sightings has declined by 50%, and 0.5 means they have increased by 50%).</w:t>
+      </w:r>
+    </w:p>
+    <w:p>
+      <w:pPr>
+        <w:pStyle w:val="FirstParagraph"/>
+      </w:pPr>
+      <w:r>
+        <w:t xml:space="preserve">There are a number of data entry issues in the dataset. Carry out an EDA and try to find them all.</w:t>
+      </w:r>
+    </w:p>
+    <w:p>
+      <w:pPr>
+        <w:pStyle w:val="BodyText"/>
+      </w:pPr>
+      <w:r>
+        <w:t xml:space="preserve">As a group, we will look at lines of code and try to spot the error(s) and figure out what these codes are doing when we run them.</w:t>
+      </w:r>
+    </w:p>
+    <w:bookmarkEnd w:id="55"/>
+    <w:bookmarkStart w:id="56" w:name="coding-puzzles"/>
+    <w:p>
+      <w:pPr>
+        <w:pStyle w:val="Heading1"/>
+      </w:pPr>
+      <w:r>
+        <w:t xml:space="preserve">Coding Puzzles</w:t>
+      </w:r>
+    </w:p>
+    <w:p>
+      <w:pPr>
+        <w:pStyle w:val="FirstParagraph"/>
+      </w:pPr>
+      <w:r>
+        <w:t xml:space="preserve">In the following snippets of code, can you identify the error? If you’re not sure, try running them and see what the error says.</w:t>
+      </w:r>
+    </w:p>
+    <w:p>
+      <w:pPr>
+        <w:pStyle w:val="SourceCode"/>
+      </w:pPr>
+      <w:r>
+        <w:rPr>
+          <w:rStyle w:val="FunctionTok"/>
+        </w:rPr>
+        <w:t xml:space="preserve">summary</w:t>
+      </w:r>
+      <w:r>
+        <w:rPr>
+          <w:rStyle w:val="NormalTok"/>
+        </w:rPr>
+        <w:t xml:space="preserve">(alc)</w:t>
+      </w:r>
+      <w:r>
+        <w:br/>
+      </w:r>
+      <w:r>
+        <w:rPr>
+          <w:rStyle w:val="NormalTok"/>
+        </w:rPr>
+        <w:t xml:space="preserve">chupa[chupa</w:t>
+      </w:r>
+      <w:r>
+        <w:rPr>
+          <w:rStyle w:val="SpecialCharTok"/>
+        </w:rPr>
+        <w:t xml:space="preserve">$</w:t>
+      </w:r>
+      <w:r>
+        <w:rPr>
+          <w:rStyle w:val="NormalTok"/>
+        </w:rPr>
+        <w:t xml:space="preserve">ufo</w:t>
+      </w:r>
+      <w:r>
+        <w:rPr>
+          <w:rStyle w:val="SpecialCharTok"/>
+        </w:rPr>
+        <w:t xml:space="preserve">==</w:t>
+      </w:r>
+      <w:r>
+        <w:rPr>
+          <w:rStyle w:val="DecValTok"/>
+        </w:rPr>
+        <w:t xml:space="preserve">9999</w:t>
+      </w:r>
+      <w:r>
+        <w:rPr>
+          <w:rStyle w:val="NormalTok"/>
+        </w:rPr>
+        <w:t xml:space="preserve">]</w:t>
+      </w:r>
+      <w:r>
+        <w:br/>
+      </w:r>
+      <w:r>
+        <w:rPr>
+          <w:rStyle w:val="NormalTok"/>
+        </w:rPr>
+        <w:t xml:space="preserve">chupa[chupa</w:t>
+      </w:r>
+      <w:r>
+        <w:rPr>
+          <w:rStyle w:val="SpecialCharTok"/>
+        </w:rPr>
+        <w:t xml:space="preserve">$</w:t>
+      </w:r>
+      <w:r>
+        <w:rPr>
+          <w:rStyle w:val="NormalTok"/>
+        </w:rPr>
+        <w:t xml:space="preserve">ufo </w:t>
+      </w:r>
+      <w:r>
+        <w:rPr>
+          <w:rStyle w:val="OtherTok"/>
+        </w:rPr>
+        <w:t xml:space="preserve">=</w:t>
+      </w:r>
+      <w:r>
+        <w:rPr>
+          <w:rStyle w:val="NormalTok"/>
+        </w:rPr>
+        <w:t xml:space="preserve"> </w:t>
+      </w:r>
+      <w:r>
+        <w:rPr>
+          <w:rStyle w:val="DecValTok"/>
+        </w:rPr>
+        <w:t xml:space="preserve">9999</w:t>
+      </w:r>
+      <w:r>
+        <w:rPr>
+          <w:rStyle w:val="NormalTok"/>
+        </w:rPr>
+        <w:t xml:space="preserve">, ]</w:t>
+      </w:r>
+      <w:r>
+        <w:br/>
+      </w:r>
+      <w:r>
+        <w:rPr>
+          <w:rStyle w:val="NormalTok"/>
+        </w:rPr>
+        <w:t xml:space="preserve">chupa[chupa</w:t>
+      </w:r>
+      <w:r>
+        <w:rPr>
+          <w:rStyle w:val="SpecialCharTok"/>
+        </w:rPr>
+        <w:t xml:space="preserve">$</w:t>
+      </w:r>
+      <w:r>
+        <w:rPr>
+          <w:rStyle w:val="NormalTok"/>
+        </w:rPr>
+        <w:t xml:space="preserve">city </w:t>
+      </w:r>
+      <w:r>
+        <w:rPr>
+          <w:rStyle w:val="OtherTok"/>
+        </w:rPr>
+        <w:t xml:space="preserve">=</w:t>
+      </w:r>
+      <w:r>
+        <w:rPr>
+          <w:rStyle w:val="NormalTok"/>
+        </w:rPr>
+        <w:t xml:space="preserve"> Houston,]</w:t>
+      </w:r>
+      <w:r>
+        <w:br/>
+      </w:r>
+      <w:r>
+        <w:rPr>
+          <w:rStyle w:val="NormalTok"/>
+        </w:rPr>
+        <w:t xml:space="preserve">ali[ali</w:t>
+      </w:r>
+      <w:r>
+        <w:rPr>
+          <w:rStyle w:val="SpecialCharTok"/>
+        </w:rPr>
+        <w:t xml:space="preserve">$</w:t>
+      </w:r>
+      <w:r>
+        <w:rPr>
+          <w:rStyle w:val="NormalTok"/>
+        </w:rPr>
+        <w:t xml:space="preserve">Length </w:t>
+      </w:r>
+      <w:r>
+        <w:rPr>
+          <w:rStyle w:val="SpecialCharTok"/>
+        </w:rPr>
+        <w:t xml:space="preserve">&gt;</w:t>
+      </w:r>
+      <w:r>
+        <w:rPr>
+          <w:rStyle w:val="NormalTok"/>
+        </w:rPr>
+        <w:t xml:space="preserve"> </w:t>
+      </w:r>
+      <w:r>
+        <w:rPr>
+          <w:rStyle w:val="DecValTok"/>
+        </w:rPr>
+        <w:t xml:space="preserve">200</w:t>
+      </w:r>
+      <w:r>
+        <w:rPr>
+          <w:rStyle w:val="NormalTok"/>
+        </w:rPr>
+        <w:t xml:space="preserve">, ]</w:t>
+      </w:r>
+      <w:r>
+        <w:br/>
+      </w:r>
+      <w:r>
+        <w:rPr>
+          <w:rStyle w:val="NormalTok"/>
+        </w:rPr>
+        <w:t xml:space="preserve">ali[ali</w:t>
+      </w:r>
+      <w:r>
+        <w:rPr>
+          <w:rStyle w:val="SpecialCharTok"/>
+        </w:rPr>
+        <w:t xml:space="preserve">$</w:t>
+      </w:r>
+      <w:r>
+        <w:rPr>
+          <w:rStyle w:val="NormalTok"/>
+        </w:rPr>
+        <w:t xml:space="preserve">bite </w:t>
+      </w:r>
+      <w:r>
+        <w:rPr>
+          <w:rStyle w:val="SpecialCharTok"/>
+        </w:rPr>
+        <w:t xml:space="preserve">&gt;</w:t>
+      </w:r>
+      <w:r>
+        <w:rPr>
+          <w:rStyle w:val="NormalTok"/>
+        </w:rPr>
+        <w:t xml:space="preserve"> </w:t>
+      </w:r>
+      <w:r>
+        <w:rPr>
+          <w:rStyle w:val="FunctionTok"/>
+        </w:rPr>
+        <w:t xml:space="preserve">mean</w:t>
+      </w:r>
+      <w:r>
+        <w:rPr>
+          <w:rStyle w:val="NormalTok"/>
+        </w:rPr>
+        <w:t xml:space="preserve">(ali</w:t>
+      </w:r>
+      <w:r>
+        <w:rPr>
+          <w:rStyle w:val="SpecialCharTok"/>
+        </w:rPr>
+        <w:t xml:space="preserve">$</w:t>
+      </w:r>
+      <w:r>
+        <w:rPr>
+          <w:rStyle w:val="NormalTok"/>
+        </w:rPr>
+        <w:t xml:space="preserve">bite), ]</w:t>
+      </w:r>
+    </w:p>
+    <w:bookmarkEnd w:id="56"/>
     <w:sectPr>
       <w:pgSz w:h="15840" w:w="12240"/>
       <w:pgMar w:bottom="1440" w:footer="720" w:gutter="0" w:header="720" w:left="1440" w:right="1440" w:top="1440"/>
@@ -7158,7 +7594,7 @@
 </file>
 
 <file path=word/numbering.xml><?xml version="1.0" encoding="utf-8"?>
-<w:numbering xmlns:aink="http://schemas.microsoft.com/office/drawing/2016/ink" xmlns:am3d="http://schemas.microsoft.com/office/drawing/2017/model3d" xmlns:cx="http://schemas.microsoft.com/office/drawing/2014/chartex" xmlns:cx1="http://schemas.microsoft.com/office/drawing/2015/9/8/chartex" xmlns:cx2="http://schemas.microsoft.com/office/drawing/2015/10/21/chartex" xmlns:cx3="http://schemas.microsoft.com/office/drawing/2016/5/9/chartex" xmlns:cx4="http://schemas.microsoft.com/office/drawing/2016/5/10/chartex" xmlns:cx5="http://schemas.microsoft.com/office/drawing/2016/5/11/chartex" xmlns:cx6="http://schemas.microsoft.com/office/drawing/2016/5/12/chartex" xmlns:cx7="http://schemas.microsoft.com/office/drawing/2016/5/13/chartex" xmlns:cx8="http://schemas.microsoft.com/office/drawing/2016/5/14/chartex" xmlns:m="http://schemas.openxmlformats.org/officeDocument/2006/math" xmlns:mc="http://schemas.openxmlformats.org/markup-compatibility/2006" xmlns:o="urn:schemas-microsoft-com:office:office" xmlns:oel="http://schemas.microsoft.com/office/2019/extlst" xmlns:r="http://schemas.openxmlformats.org/officeDocument/2006/relationships" xmlns:v="urn:schemas-microsoft-com:vml" xmlns:w="http://schemas.openxmlformats.org/wordprocessingml/2006/main" xmlns:w10="urn:schemas-microsoft-com:office:word" xmlns:w14="http://schemas.microsoft.com/office/word/2010/wordml" xmlns:w15="http://schemas.microsoft.com/office/word/2012/wordml" xmlns:w16="http://schemas.microsoft.com/office/word/2018/wordml" xmlns:w16cex="http://schemas.microsoft.com/office/word/2018/wordml/cex" xmlns:w16cid="http://schemas.microsoft.com/office/word/2016/wordml/cid" xmlns:w16du="http://schemas.microsoft.com/office/word/2023/wordml/word16du" xmlns:w16sdtdh="http://schemas.microsoft.com/office/word/2020/wordml/sdtdatahash" xmlns:w16se="http://schemas.microsoft.com/office/word/2015/wordml/symex" xmlns:wne="http://schemas.microsoft.com/office/word/2006/wordml" xmlns:wp="http://schemas.openxmlformats.org/drawingml/2006/wordprocessingDrawing" xmlns:wp14="http://schemas.microsoft.com/office/word/2010/wordprocessingDrawing" xmlns:wpc="http://schemas.microsoft.com/office/word/2010/wordprocessingCanvas" xmlns:wpg="http://schemas.microsoft.com/office/word/2010/wordprocessingGroup" xmlns:wpi="http://schemas.microsoft.com/office/word/2010/wordprocessingInk" xmlns:wps="http://schemas.microsoft.com/office/word/2010/wordprocessingShape" mc:Ignorable="w14 w15 w16se w16cid w16 w16cex w16sdtdh w16du wp14">
+<w:numbering xmlns:aink="http://schemas.microsoft.com/office/drawing/2016/ink" xmlns:am3d="http://schemas.microsoft.com/office/drawing/2017/model3d" xmlns:cx="http://schemas.microsoft.com/office/drawing/2014/chartex" xmlns:cx1="http://schemas.microsoft.com/office/drawing/2015/9/8/chartex" xmlns:cx2="http://schemas.microsoft.com/office/drawing/2015/10/21/chartex" xmlns:cx3="http://schemas.microsoft.com/office/drawing/2016/5/9/chartex" xmlns:cx4="http://schemas.microsoft.com/office/drawing/2016/5/10/chartex" xmlns:cx5="http://schemas.microsoft.com/office/drawing/2016/5/11/chartex" xmlns:cx6="http://schemas.microsoft.com/office/drawing/2016/5/12/chartex" xmlns:cx7="http://schemas.microsoft.com/office/drawing/2016/5/13/chartex" xmlns:cx8="http://schemas.microsoft.com/office/drawing/2016/5/14/chartex" xmlns:m="http://schemas.openxmlformats.org/officeDocument/2006/math" xmlns:mc="http://schemas.openxmlformats.org/markup-compatibility/2006" xmlns:o="urn:schemas-microsoft-com:office:office" xmlns:oel="http://schemas.microsoft.com/office/2019/extlst" xmlns:r="http://schemas.openxmlformats.org/officeDocument/2006/relationships" xmlns:v="urn:schemas-microsoft-com:vml" xmlns:w="http://schemas.openxmlformats.org/wordprocessingml/2006/main" xmlns:w10="urn:schemas-microsoft-com:office:word" xmlns:w14="http://schemas.microsoft.com/office/word/2010/wordml" xmlns:w15="http://schemas.microsoft.com/office/word/2012/wordml" xmlns:w16="http://schemas.microsoft.com/office/word/2018/wordml" xmlns:w16cex="http://schemas.microsoft.com/office/word/2018/wordml/cex" xmlns:w16cid="http://schemas.microsoft.com/office/word/2016/wordml/cid" xmlns:w16du="http://schemas.microsoft.com/office/word/2023/wordml/word16du" xmlns:w16sdtdh="http://schemas.microsoft.com/office/word/2020/wordml/sdtdatahash" xmlns:w16sdtfl="http://schemas.microsoft.com/office/word/2024/wordml/sdtformatlock" xmlns:w16se="http://schemas.microsoft.com/office/word/2015/wordml/symex" xmlns:wne="http://schemas.microsoft.com/office/word/2006/wordml" xmlns:wp="http://schemas.openxmlformats.org/drawingml/2006/wordprocessingDrawing" xmlns:wp14="http://schemas.microsoft.com/office/word/2010/wordprocessingDrawing" xmlns:wpc="http://schemas.microsoft.com/office/word/2010/wordprocessingCanvas" xmlns:wpg="http://schemas.microsoft.com/office/word/2010/wordprocessingGroup" xmlns:wpi="http://schemas.microsoft.com/office/word/2010/wordprocessingInk" xmlns:wps="http://schemas.microsoft.com/office/word/2010/wordprocessingShape" mc:Ignorable="w14 w15 w16se w16cid w16 w16cex w16sdtdh w16sdtfl w16du wp14">
   <w:abstractNum w15:restartNumberingAfterBreak="0" w:abstractNumId="0">
     <w:nsid w:val="0000A990"/>
     <w:multiLevelType w:val="multilevel"/>
@@ -7400,14 +7836,14 @@
     </w:lvl>
   </w:abstractNum>
   <w:abstractNum w:abstractNumId="990">
-    <w:nsid w:val="0000A990"/>
+    <w:nsid w:val="A990"/>
     <w:multiLevelType w:val="multilevel"/>
     <w:lvl w:ilvl="0">
       <w:numFmt w:val="bullet"/>
       <w:lvlText w:val=" "/>
       <w:lvlJc w:val="left"/>
       <w:pPr>
-        <w:ind w:left="720" w:hanging="360"/>
+        <w:ind w:left="720" w:hanging="480"/>
       </w:pPr>
     </w:lvl>
     <w:lvl w:ilvl="1">
@@ -7415,7 +7851,7 @@
       <w:lvlText w:val=" "/>
       <w:lvlJc w:val="left"/>
       <w:pPr>
-        <w:ind w:left="1440" w:hanging="360"/>
+        <w:ind w:left="1440" w:hanging="480"/>
       </w:pPr>
     </w:lvl>
     <w:lvl w:ilvl="2">
@@ -7423,7 +7859,7 @@
       <w:lvlText w:val=" "/>
       <w:lvlJc w:val="left"/>
       <w:pPr>
-        <w:ind w:left="2160" w:hanging="360"/>
+        <w:ind w:left="2160" w:hanging="480"/>
       </w:pPr>
     </w:lvl>
     <w:lvl w:ilvl="3">
@@ -7431,7 +7867,7 @@
       <w:lvlText w:val=" "/>
       <w:lvlJc w:val="left"/>
       <w:pPr>
-        <w:ind w:left="2880" w:hanging="360"/>
+        <w:ind w:left="2880" w:hanging="480"/>
       </w:pPr>
     </w:lvl>
     <w:lvl w:ilvl="4">
@@ -7439,7 +7875,7 @@
       <w:lvlText w:val=" "/>
       <w:lvlJc w:val="left"/>
       <w:pPr>
-        <w:ind w:left="3600" w:hanging="360"/>
+        <w:ind w:left="3600" w:hanging="480"/>
       </w:pPr>
     </w:lvl>
     <w:lvl w:ilvl="5">
@@ -7447,7 +7883,7 @@
       <w:lvlText w:val=" "/>
       <w:lvlJc w:val="left"/>
       <w:pPr>
-        <w:ind w:left="4320" w:hanging="360"/>
+        <w:ind w:left="4320" w:hanging="480"/>
       </w:pPr>
     </w:lvl>
     <w:lvl w:ilvl="6">
@@ -7455,7 +7891,7 @@
       <w:lvlText w:val=" "/>
       <w:lvlJc w:val="left"/>
       <w:pPr>
-        <w:ind w:left="5040" w:hanging="360"/>
+        <w:ind w:left="5040" w:hanging="480"/>
       </w:pPr>
     </w:lvl>
     <w:lvl w:ilvl="7">
@@ -7463,7 +7899,7 @@
       <w:lvlText w:val=" "/>
       <w:lvlJc w:val="left"/>
       <w:pPr>
-        <w:ind w:left="5760" w:hanging="360"/>
+        <w:ind w:left="5760" w:hanging="480"/>
       </w:pPr>
     </w:lvl>
     <w:lvl w:ilvl="8">
@@ -7471,12 +7907,12 @@
       <w:lvlText w:val=" "/>
       <w:lvlJc w:val="left"/>
       <w:pPr>
-        <w:ind w:left="6480" w:hanging="360"/>
+        <w:ind w:left="6480" w:hanging="480"/>
       </w:pPr>
     </w:lvl>
   </w:abstractNum>
   <w:abstractNum w:abstractNumId="99411">
-    <w:nsid w:val="00A99411"/>
+    <w:nsid w:val="A99411"/>
     <w:multiLevelType w:val="multilevel"/>
     <w:lvl w:ilvl="0">
       <w:start w:val="1"/>
@@ -7484,7 +7920,7 @@
       <w:lvlText w:val="%1."/>
       <w:lvlJc w:val="left"/>
       <w:pPr>
-        <w:ind w:left="720" w:hanging="360"/>
+        <w:ind w:left="720" w:hanging="480"/>
       </w:pPr>
     </w:lvl>
     <w:lvl w:ilvl="1">
@@ -7493,7 +7929,7 @@
       <w:lvlText w:val="%2."/>
       <w:lvlJc w:val="left"/>
       <w:pPr>
-        <w:ind w:left="1440" w:hanging="360"/>
+        <w:ind w:left="1440" w:hanging="480"/>
       </w:pPr>
     </w:lvl>
     <w:lvl w:ilvl="2">
@@ -7502,7 +7938,7 @@
       <w:lvlText w:val="%3."/>
       <w:lvlJc w:val="left"/>
       <w:pPr>
-        <w:ind w:left="2160" w:hanging="360"/>
+        <w:ind w:left="2160" w:hanging="480"/>
       </w:pPr>
     </w:lvl>
     <w:lvl w:ilvl="3">
@@ -7511,7 +7947,7 @@
       <w:lvlText w:val="%4."/>
       <w:lvlJc w:val="left"/>
       <w:pPr>
-        <w:ind w:left="2880" w:hanging="360"/>
+        <w:ind w:left="2880" w:hanging="480"/>
       </w:pPr>
     </w:lvl>
     <w:lvl w:ilvl="4">
@@ -7520,7 +7956,7 @@
       <w:lvlText w:val="%5."/>
       <w:lvlJc w:val="left"/>
       <w:pPr>
-        <w:ind w:left="3600" w:hanging="360"/>
+        <w:ind w:left="3600" w:hanging="480"/>
       </w:pPr>
     </w:lvl>
     <w:lvl w:ilvl="5">
@@ -7529,7 +7965,7 @@
       <w:lvlText w:val="%6."/>
       <w:lvlJc w:val="left"/>
       <w:pPr>
-        <w:ind w:left="4320" w:hanging="360"/>
+        <w:ind w:left="4320" w:hanging="480"/>
       </w:pPr>
     </w:lvl>
     <w:lvl w:ilvl="6">
@@ -7538,7 +7974,7 @@
       <w:lvlText w:val="%7."/>
       <w:lvlJc w:val="left"/>
       <w:pPr>
-        <w:ind w:left="5040" w:hanging="360"/>
+        <w:ind w:left="5040" w:hanging="480"/>
       </w:pPr>
     </w:lvl>
     <w:lvl w:ilvl="7">
@@ -7547,7 +7983,7 @@
       <w:lvlText w:val="%8."/>
       <w:lvlJc w:val="left"/>
       <w:pPr>
-        <w:ind w:left="5760" w:hanging="360"/>
+        <w:ind w:left="5760" w:hanging="480"/>
       </w:pPr>
     </w:lvl>
     <w:lvl w:ilvl="8">
@@ -7556,115 +7992,88 @@
       <w:lvlText w:val="%9."/>
       <w:lvlJc w:val="left"/>
       <w:pPr>
-        <w:ind w:left="6480" w:hanging="360"/>
+        <w:ind w:left="6480" w:hanging="480"/>
       </w:pPr>
     </w:lvl>
   </w:abstractNum>
   <w:abstractNum w:abstractNumId="991">
-    <w:nsid w:val="0000A991"/>
+    <w:nsid w:val="A991"/>
     <w:multiLevelType w:val="multilevel"/>
     <w:lvl w:ilvl="0">
       <w:numFmt w:val="bullet"/>
-      <w:lvlText w:val=""/>
+      <w:lvlText w:val="•"/>
       <w:lvlJc w:val="left"/>
       <w:pPr>
-        <w:ind w:left="720" w:hanging="360"/>
-      </w:pPr>
-      <w:rPr>
-        <w:rFonts w:ascii="Symbol" w:hAnsi="Symbol" w:cs="Symbol" w:hint="default"/>
-      </w:rPr>
+        <w:ind w:left="720" w:hanging="480"/>
+      </w:pPr>
     </w:lvl>
     <w:lvl w:ilvl="1">
       <w:numFmt w:val="bullet"/>
-      <w:lvlText w:val="o"/>
+      <w:lvlText w:val="–"/>
       <w:lvlJc w:val="left"/>
       <w:pPr>
-        <w:ind w:left="1440" w:hanging="360"/>
-      </w:pPr>
-      <w:rPr>
-        <w:rFonts w:ascii="Courier New" w:hAnsi="Courier New" w:cs="Courier New" w:hint="default"/>
-      </w:rPr>
+        <w:ind w:left="1440" w:hanging="480"/>
+      </w:pPr>
     </w:lvl>
     <w:lvl w:ilvl="2">
       <w:numFmt w:val="bullet"/>
-      <w:lvlText w:val=""/>
+      <w:lvlText w:val="•"/>
       <w:lvlJc w:val="left"/>
       <w:pPr>
-        <w:ind w:left="2160" w:hanging="360"/>
-      </w:pPr>
-      <w:rPr>
-        <w:rFonts w:ascii="Wingdings" w:hAnsi="Wingdings" w:cs="Wingdings" w:hint="default"/>
-      </w:rPr>
+        <w:ind w:left="2160" w:hanging="480"/>
+      </w:pPr>
     </w:lvl>
     <w:lvl w:ilvl="3">
       <w:numFmt w:val="bullet"/>
-      <w:lvlText w:val=""/>
+      <w:lvlText w:val="–"/>
       <w:lvlJc w:val="left"/>
       <w:pPr>
-        <w:ind w:left="2880" w:hanging="360"/>
-      </w:pPr>
-      <w:rPr>
-        <w:rFonts w:ascii="Symbol" w:hAnsi="Symbol" w:cs="Symbol" w:hint="default"/>
-      </w:rPr>
+        <w:ind w:left="2880" w:hanging="480"/>
+      </w:pPr>
     </w:lvl>
     <w:lvl w:ilvl="4">
       <w:numFmt w:val="bullet"/>
-      <w:lvlText w:val="o"/>
+      <w:lvlText w:val="•"/>
       <w:lvlJc w:val="left"/>
       <w:pPr>
-        <w:ind w:left="3600" w:hanging="360"/>
-      </w:pPr>
-      <w:rPr>
-        <w:rFonts w:ascii="Courier New" w:hAnsi="Courier New" w:cs="Courier New" w:hint="default"/>
-      </w:rPr>
+        <w:ind w:left="3600" w:hanging="480"/>
+      </w:pPr>
     </w:lvl>
     <w:lvl w:ilvl="5">
       <w:numFmt w:val="bullet"/>
-      <w:lvlText w:val=""/>
+      <w:lvlText w:val="–"/>
       <w:lvlJc w:val="left"/>
       <w:pPr>
-        <w:ind w:left="4320" w:hanging="360"/>
-      </w:pPr>
-      <w:rPr>
-        <w:rFonts w:ascii="Wingdings" w:hAnsi="Wingdings" w:cs="Wingdings" w:hint="default"/>
-      </w:rPr>
+        <w:ind w:left="4320" w:hanging="480"/>
+      </w:pPr>
     </w:lvl>
     <w:lvl w:ilvl="6">
       <w:numFmt w:val="bullet"/>
-      <w:lvlText w:val=""/>
+      <w:lvlText w:val="•"/>
       <w:lvlJc w:val="left"/>
       <w:pPr>
-        <w:ind w:left="5040" w:hanging="360"/>
-      </w:pPr>
-      <w:rPr>
-        <w:rFonts w:ascii="Symbol" w:hAnsi="Symbol" w:cs="Symbol" w:hint="default"/>
-      </w:rPr>
+        <w:ind w:left="5040" w:hanging="480"/>
+      </w:pPr>
     </w:lvl>
     <w:lvl w:ilvl="7">
       <w:numFmt w:val="bullet"/>
-      <w:lvlText w:val="o"/>
+      <w:lvlText w:val="–"/>
       <w:lvlJc w:val="left"/>
       <w:pPr>
-        <w:ind w:left="5760" w:hanging="360"/>
-      </w:pPr>
-      <w:rPr>
-        <w:rFonts w:ascii="Courier New" w:hAnsi="Courier New" w:cs="Courier New" w:hint="default"/>
-      </w:rPr>
+        <w:ind w:left="5760" w:hanging="480"/>
+      </w:pPr>
     </w:lvl>
     <w:lvl w:ilvl="8">
       <w:numFmt w:val="bullet"/>
-      <w:lvlText w:val=""/>
+      <w:lvlText w:val="•"/>
       <w:lvlJc w:val="left"/>
       <w:pPr>
-        <w:ind w:left="6480" w:hanging="360"/>
-      </w:pPr>
-      <w:rPr>
-        <w:rFonts w:ascii="Wingdings" w:hAnsi="Wingdings" w:cs="Wingdings" w:hint="default"/>
-      </w:rPr>
+        <w:ind w:left="6480" w:hanging="480"/>
+      </w:pPr>
     </w:lvl>
   </w:abstractNum>
   <w:abstractNum w:abstractNumId="99412">
-    <w:nsid w:val="00A99412"/>
+    <w:nsid w:val="A99412"/>
     <w:multiLevelType w:val="multilevel"/>
     <w:lvl w:ilvl="0">
       <w:start w:val="2"/>
@@ -7672,7 +8081,7 @@
       <w:lvlText w:val="%1."/>
       <w:lvlJc w:val="left"/>
       <w:pPr>
-        <w:ind w:left="720" w:hanging="360"/>
+        <w:ind w:left="720" w:hanging="480"/>
       </w:pPr>
     </w:lvl>
     <w:lvl w:ilvl="1">
@@ -7681,7 +8090,7 @@
       <w:lvlText w:val="%2."/>
       <w:lvlJc w:val="left"/>
       <w:pPr>
-        <w:ind w:left="1440" w:hanging="360"/>
+        <w:ind w:left="1440" w:hanging="480"/>
       </w:pPr>
     </w:lvl>
     <w:lvl w:ilvl="2">
@@ -7690,7 +8099,7 @@
       <w:lvlText w:val="%3."/>
       <w:lvlJc w:val="left"/>
       <w:pPr>
-        <w:ind w:left="2160" w:hanging="360"/>
+        <w:ind w:left="2160" w:hanging="480"/>
       </w:pPr>
     </w:lvl>
     <w:lvl w:ilvl="3">
@@ -7699,7 +8108,7 @@
       <w:lvlText w:val="%4."/>
       <w:lvlJc w:val="left"/>
       <w:pPr>
-        <w:ind w:left="2880" w:hanging="360"/>
+        <w:ind w:left="2880" w:hanging="480"/>
       </w:pPr>
     </w:lvl>
     <w:lvl w:ilvl="4">
@@ -7708,7 +8117,7 @@
       <w:lvlText w:val="%5."/>
       <w:lvlJc w:val="left"/>
       <w:pPr>
-        <w:ind w:left="3600" w:hanging="360"/>
+        <w:ind w:left="3600" w:hanging="480"/>
       </w:pPr>
     </w:lvl>
     <w:lvl w:ilvl="5">
@@ -7717,7 +8126,7 @@
       <w:lvlText w:val="%6."/>
       <w:lvlJc w:val="left"/>
       <w:pPr>
-        <w:ind w:left="4320" w:hanging="360"/>
+        <w:ind w:left="4320" w:hanging="480"/>
       </w:pPr>
     </w:lvl>
     <w:lvl w:ilvl="6">
@@ -7726,7 +8135,7 @@
       <w:lvlText w:val="%7."/>
       <w:lvlJc w:val="left"/>
       <w:pPr>
-        <w:ind w:left="5040" w:hanging="360"/>
+        <w:ind w:left="5040" w:hanging="480"/>
       </w:pPr>
     </w:lvl>
     <w:lvl w:ilvl="7">
@@ -7735,7 +8144,7 @@
       <w:lvlText w:val="%8."/>
       <w:lvlJc w:val="left"/>
       <w:pPr>
-        <w:ind w:left="5760" w:hanging="360"/>
+        <w:ind w:left="5760" w:hanging="480"/>
       </w:pPr>
     </w:lvl>
     <w:lvl w:ilvl="8">
@@ -7744,12 +8153,12 @@
       <w:lvlText w:val="%9."/>
       <w:lvlJc w:val="left"/>
       <w:pPr>
-        <w:ind w:left="6480" w:hanging="360"/>
+        <w:ind w:left="6480" w:hanging="480"/>
       </w:pPr>
     </w:lvl>
   </w:abstractNum>
   <w:abstractNum w:abstractNumId="99413">
-    <w:nsid w:val="00A99413"/>
+    <w:nsid w:val="A99413"/>
     <w:multiLevelType w:val="multilevel"/>
     <w:lvl w:ilvl="0">
       <w:start w:val="3"/>
@@ -7757,7 +8166,7 @@
       <w:lvlText w:val="%1."/>
       <w:lvlJc w:val="left"/>
       <w:pPr>
-        <w:ind w:left="720" w:hanging="360"/>
+        <w:ind w:left="720" w:hanging="480"/>
       </w:pPr>
     </w:lvl>
     <w:lvl w:ilvl="1">
@@ -7766,7 +8175,7 @@
       <w:lvlText w:val="%2."/>
       <w:lvlJc w:val="left"/>
       <w:pPr>
-        <w:ind w:left="1440" w:hanging="360"/>
+        <w:ind w:left="1440" w:hanging="480"/>
       </w:pPr>
     </w:lvl>
     <w:lvl w:ilvl="2">
@@ -7775,7 +8184,7 @@
       <w:lvlText w:val="%3."/>
       <w:lvlJc w:val="left"/>
       <w:pPr>
-        <w:ind w:left="2160" w:hanging="360"/>
+        <w:ind w:left="2160" w:hanging="480"/>
       </w:pPr>
     </w:lvl>
     <w:lvl w:ilvl="3">
@@ -7784,7 +8193,7 @@
       <w:lvlText w:val="%4."/>
       <w:lvlJc w:val="left"/>
       <w:pPr>
-        <w:ind w:left="2880" w:hanging="360"/>
+        <w:ind w:left="2880" w:hanging="480"/>
       </w:pPr>
     </w:lvl>
     <w:lvl w:ilvl="4">
@@ -7793,7 +8202,7 @@
       <w:lvlText w:val="%5."/>
       <w:lvlJc w:val="left"/>
       <w:pPr>
-        <w:ind w:left="3600" w:hanging="360"/>
+        <w:ind w:left="3600" w:hanging="480"/>
       </w:pPr>
     </w:lvl>
     <w:lvl w:ilvl="5">
@@ -7802,7 +8211,7 @@
       <w:lvlText w:val="%6."/>
       <w:lvlJc w:val="left"/>
       <w:pPr>
-        <w:ind w:left="4320" w:hanging="360"/>
+        <w:ind w:left="4320" w:hanging="480"/>
       </w:pPr>
     </w:lvl>
     <w:lvl w:ilvl="6">
@@ -7811,7 +8220,7 @@
       <w:lvlText w:val="%7."/>
       <w:lvlJc w:val="left"/>
       <w:pPr>
-        <w:ind w:left="5040" w:hanging="360"/>
+        <w:ind w:left="5040" w:hanging="480"/>
       </w:pPr>
     </w:lvl>
     <w:lvl w:ilvl="7">
@@ -7820,7 +8229,7 @@
       <w:lvlText w:val="%8."/>
       <w:lvlJc w:val="left"/>
       <w:pPr>
-        <w:ind w:left="5760" w:hanging="360"/>
+        <w:ind w:left="5760" w:hanging="480"/>
       </w:pPr>
     </w:lvl>
     <w:lvl w:ilvl="8">
@@ -7829,7 +8238,7 @@
       <w:lvlText w:val="%9."/>
       <w:lvlJc w:val="left"/>
       <w:pPr>
-        <w:ind w:left="6480" w:hanging="360"/>
+        <w:ind w:left="6480" w:hanging="480"/>
       </w:pPr>
     </w:lvl>
   </w:abstractNum>
@@ -8100,11 +8509,14 @@
   <w:num w:numId="1013">
     <w:abstractNumId w:val="991"/>
   </w:num>
+  <w:num w:numId="1014">
+    <w:abstractNumId w:val="991"/>
+  </w:num>
 </w:numbering>
 </file>
 
 <file path=word/styles.xml><?xml version="1.0" encoding="utf-8"?>
-<w:styles xmlns:mc="http://schemas.openxmlformats.org/markup-compatibility/2006" xmlns:r="http://schemas.openxmlformats.org/officeDocument/2006/relationships" xmlns:w="http://schemas.openxmlformats.org/wordprocessingml/2006/main" xmlns:w14="http://schemas.microsoft.com/office/word/2010/wordml" xmlns:w15="http://schemas.microsoft.com/office/word/2012/wordml" xmlns:w16="http://schemas.microsoft.com/office/word/2018/wordml" xmlns:w16cex="http://schemas.microsoft.com/office/word/2018/wordml/cex" xmlns:w16cid="http://schemas.microsoft.com/office/word/2016/wordml/cid" xmlns:w16du="http://schemas.microsoft.com/office/word/2023/wordml/word16du" xmlns:w16sdtdh="http://schemas.microsoft.com/office/word/2020/wordml/sdtdatahash" xmlns:w16se="http://schemas.microsoft.com/office/word/2015/wordml/symex" mc:Ignorable="w14 w15 w16se w16cid w16 w16cex w16sdtdh w16du">
+<w:styles xmlns:mc="http://schemas.openxmlformats.org/markup-compatibility/2006" xmlns:r="http://schemas.openxmlformats.org/officeDocument/2006/relationships" xmlns:w="http://schemas.openxmlformats.org/wordprocessingml/2006/main" xmlns:w14="http://schemas.microsoft.com/office/word/2010/wordml" xmlns:w15="http://schemas.microsoft.com/office/word/2012/wordml" xmlns:w16="http://schemas.microsoft.com/office/word/2018/wordml" xmlns:w16cex="http://schemas.microsoft.com/office/word/2018/wordml/cex" xmlns:w16cid="http://schemas.microsoft.com/office/word/2016/wordml/cid" xmlns:w16du="http://schemas.microsoft.com/office/word/2023/wordml/word16du" xmlns:w16sdtdh="http://schemas.microsoft.com/office/word/2020/wordml/sdtdatahash" xmlns:w16sdtfl="http://schemas.microsoft.com/office/word/2024/wordml/sdtformatlock" xmlns:w16se="http://schemas.microsoft.com/office/word/2015/wordml/symex" mc:Ignorable="w14 w15 w16se w16cid w16 w16cex w16sdtdh w16sdtfl w16du">
   <w:docDefaults>
     <w:rPrDefault>
       <w:rPr>
@@ -8798,9 +9210,10 @@
     <w:name w:val="Verbatim Char"/>
     <w:basedOn w:val="CaptionChar"/>
     <w:link w:val="SourceCode"/>
-    <w:rsid w:val="00F34E30"/>
+    <w:rsid w:val="00796E50"/>
     <w:rPr>
       <w:rFonts w:ascii="Consolas" w:hAnsi="Consolas"/>
+      <w:sz w:val="22"/>
       <w:shd w:color="auto" w:fill="F8F8F8" w:val="clear"/>
     </w:rPr>
   </w:style>
@@ -8845,10 +9258,11 @@
     <w:name w:val="Source Code"/>
     <w:basedOn w:val="Normal"/>
     <w:link w:val="VerbatimChar"/>
-    <w:rsid w:val="00F34E30"/>
+    <w:rsid w:val="00796E50"/>
     <w:pPr>
       <w:shd w:color="auto" w:fill="F8F8F8" w:val="clear"/>
       <w:wordWrap w:val="0"/>
+      <w:textboxTightWrap w:val="allLines"/>
     </w:pPr>
     <w:rPr>
       <w:rFonts w:ascii="Consolas" w:hAnsi="Consolas"/>
@@ -8861,6 +9275,7 @@
       <w:rFonts w:ascii="Consolas" w:hAnsi="Consolas"/>
       <w:b/>
       <w:color w:val="204A87"/>
+      <w:sz w:val="22"/>
       <w:shd w:color="auto" w:fill="F8F8F8" w:val="clear"/>
     </w:rPr>
   </w:style>
@@ -8870,6 +9285,7 @@
     <w:rPr>
       <w:rFonts w:ascii="Consolas" w:hAnsi="Consolas"/>
       <w:color w:val="204A87"/>
+      <w:sz w:val="22"/>
       <w:shd w:color="auto" w:fill="F8F8F8" w:val="clear"/>
     </w:rPr>
   </w:style>
@@ -8879,6 +9295,7 @@
     <w:rPr>
       <w:rFonts w:ascii="Consolas" w:hAnsi="Consolas"/>
       <w:color w:val="0000CF"/>
+      <w:sz w:val="22"/>
       <w:shd w:color="auto" w:fill="F8F8F8" w:val="clear"/>
     </w:rPr>
   </w:style>
@@ -8888,6 +9305,7 @@
     <w:rPr>
       <w:rFonts w:ascii="Consolas" w:hAnsi="Consolas"/>
       <w:color w:val="0000CF"/>
+      <w:sz w:val="22"/>
       <w:shd w:color="auto" w:fill="F8F8F8" w:val="clear"/>
     </w:rPr>
   </w:style>
@@ -8897,6 +9315,7 @@
     <w:rPr>
       <w:rFonts w:ascii="Consolas" w:hAnsi="Consolas"/>
       <w:color w:val="0000CF"/>
+      <w:sz w:val="22"/>
       <w:shd w:color="auto" w:fill="F8F8F8" w:val="clear"/>
     </w:rPr>
   </w:style>
@@ -8907,6 +9326,7 @@
     <w:rPr>
       <w:rFonts w:ascii="Consolas" w:hAnsi="Consolas"/>
       <w:color w:themeColor="accent2" w:themeShade="BF" w:val="943634"/>
+      <w:sz w:val="22"/>
       <w:shd w:color="auto" w:fill="F8F8F8" w:val="clear"/>
     </w:rPr>
   </w:style>
@@ -8916,6 +9336,7 @@
     <w:rPr>
       <w:rFonts w:ascii="Consolas" w:hAnsi="Consolas"/>
       <w:color w:val="4E9A06"/>
+      <w:sz w:val="22"/>
       <w:shd w:color="auto" w:fill="F8F8F8" w:val="clear"/>
     </w:rPr>
   </w:style>
@@ -8926,6 +9347,7 @@
       <w:rFonts w:ascii="Consolas" w:hAnsi="Consolas"/>
       <w:b/>
       <w:color w:val="CE5C00"/>
+      <w:sz w:val="22"/>
       <w:shd w:color="auto" w:fill="F8F8F8" w:val="clear"/>
     </w:rPr>
   </w:style>
@@ -8935,6 +9357,7 @@
     <w:rPr>
       <w:rFonts w:ascii="Consolas" w:hAnsi="Consolas"/>
       <w:color w:val="4E9A06"/>
+      <w:sz w:val="22"/>
       <w:shd w:color="auto" w:fill="F8F8F8" w:val="clear"/>
     </w:rPr>
   </w:style>
@@ -8944,6 +9367,7 @@
     <w:rPr>
       <w:rFonts w:ascii="Consolas" w:hAnsi="Consolas"/>
       <w:color w:val="4E9A06"/>
+      <w:sz w:val="22"/>
       <w:shd w:color="auto" w:fill="F8F8F8" w:val="clear"/>
     </w:rPr>
   </w:style>
@@ -8953,6 +9377,7 @@
     <w:rPr>
       <w:rFonts w:ascii="Consolas" w:hAnsi="Consolas"/>
       <w:color w:val="4E9A06"/>
+      <w:sz w:val="22"/>
       <w:shd w:color="auto" w:fill="F8F8F8" w:val="clear"/>
     </w:rPr>
   </w:style>
@@ -8961,6 +9386,7 @@
     <w:basedOn w:val="VerbatimChar"/>
     <w:rPr>
       <w:rFonts w:ascii="Consolas" w:hAnsi="Consolas"/>
+      <w:sz w:val="22"/>
       <w:shd w:color="auto" w:fill="F8F8F8" w:val="clear"/>
     </w:rPr>
   </w:style>
@@ -8972,6 +9398,7 @@
       <w:rFonts w:ascii="Consolas" w:hAnsi="Consolas"/>
       <w:i/>
       <w:color w:themeColor="accent4" w:themeTint="99" w:val="B2A1C7"/>
+      <w:sz w:val="22"/>
       <w:shd w:color="auto" w:fill="F8F8F8" w:val="clear"/>
     </w:rPr>
   </w:style>
@@ -8983,6 +9410,7 @@
       <w:b/>
       <w:i/>
       <w:color w:val="8F5902"/>
+      <w:sz w:val="22"/>
       <w:shd w:color="auto" w:fill="F8F8F8" w:val="clear"/>
     </w:rPr>
   </w:style>
@@ -8994,6 +9422,7 @@
       <w:b/>
       <w:i/>
       <w:color w:val="8F5902"/>
+      <w:sz w:val="22"/>
       <w:shd w:color="auto" w:fill="F8F8F8" w:val="clear"/>
     </w:rPr>
   </w:style>
@@ -9005,6 +9434,7 @@
       <w:b/>
       <w:i/>
       <w:color w:val="8F5902"/>
+      <w:sz w:val="22"/>
       <w:shd w:color="auto" w:fill="F8F8F8" w:val="clear"/>
     </w:rPr>
   </w:style>
@@ -9014,6 +9444,7 @@
     <w:rPr>
       <w:rFonts w:ascii="Consolas" w:hAnsi="Consolas"/>
       <w:color w:val="8F5902"/>
+      <w:sz w:val="22"/>
       <w:shd w:color="auto" w:fill="F8F8F8" w:val="clear"/>
     </w:rPr>
   </w:style>
@@ -9025,6 +9456,7 @@
       <w:rFonts w:ascii="Consolas" w:hAnsi="Consolas"/>
       <w:b/>
       <w:color w:themeColor="accent6" w:val="F79646"/>
+      <w:sz w:val="22"/>
       <w:shd w:color="auto" w:fill="F8F8F8" w:val="clear"/>
     </w:rPr>
   </w:style>
@@ -9034,6 +9466,7 @@
     <w:rPr>
       <w:rFonts w:ascii="Consolas" w:hAnsi="Consolas"/>
       <w:color w:val="000000"/>
+      <w:sz w:val="22"/>
       <w:shd w:color="auto" w:fill="F8F8F8" w:val="clear"/>
     </w:rPr>
   </w:style>
@@ -9044,6 +9477,7 @@
       <w:rFonts w:ascii="Consolas" w:hAnsi="Consolas"/>
       <w:b/>
       <w:color w:val="204A87"/>
+      <w:sz w:val="22"/>
       <w:shd w:color="auto" w:fill="F8F8F8" w:val="clear"/>
     </w:rPr>
   </w:style>
@@ -9054,6 +9488,7 @@
       <w:rFonts w:ascii="Consolas" w:hAnsi="Consolas"/>
       <w:b/>
       <w:color w:val="CE5C00"/>
+      <w:sz w:val="22"/>
       <w:shd w:color="auto" w:fill="F8F8F8" w:val="clear"/>
     </w:rPr>
   </w:style>
@@ -9062,6 +9497,7 @@
     <w:basedOn w:val="VerbatimChar"/>
     <w:rPr>
       <w:rFonts w:ascii="Consolas" w:hAnsi="Consolas"/>
+      <w:sz w:val="22"/>
       <w:shd w:color="auto" w:fill="F8F8F8" w:val="clear"/>
     </w:rPr>
   </w:style>
@@ -9070,6 +9506,7 @@
     <w:basedOn w:val="VerbatimChar"/>
     <w:rPr>
       <w:rFonts w:ascii="Consolas" w:hAnsi="Consolas"/>
+      <w:sz w:val="22"/>
       <w:shd w:color="auto" w:fill="F8F8F8" w:val="clear"/>
     </w:rPr>
   </w:style>
@@ -9080,6 +9517,7 @@
       <w:rFonts w:ascii="Consolas" w:hAnsi="Consolas"/>
       <w:i/>
       <w:color w:val="8F5902"/>
+      <w:sz w:val="22"/>
       <w:shd w:color="auto" w:fill="F8F8F8" w:val="clear"/>
     </w:rPr>
   </w:style>
@@ -9089,6 +9527,7 @@
     <w:rPr>
       <w:rFonts w:ascii="Consolas" w:hAnsi="Consolas"/>
       <w:color w:val="204A87"/>
+      <w:sz w:val="22"/>
       <w:shd w:color="auto" w:fill="F8F8F8" w:val="clear"/>
     </w:rPr>
   </w:style>
@@ -9097,6 +9536,7 @@
     <w:basedOn w:val="VerbatimChar"/>
     <w:rPr>
       <w:rFonts w:ascii="Consolas" w:hAnsi="Consolas"/>
+      <w:sz w:val="22"/>
       <w:shd w:color="auto" w:fill="F8F8F8" w:val="clear"/>
     </w:rPr>
   </w:style>
@@ -9108,6 +9548,7 @@
       <w:b/>
       <w:i/>
       <w:color w:val="8F5902"/>
+      <w:sz w:val="22"/>
       <w:shd w:color="auto" w:fill="F8F8F8" w:val="clear"/>
     </w:rPr>
   </w:style>
@@ -9119,6 +9560,7 @@
       <w:b/>
       <w:i/>
       <w:color w:val="8F5902"/>
+      <w:sz w:val="22"/>
       <w:shd w:color="auto" w:fill="F8F8F8" w:val="clear"/>
     </w:rPr>
   </w:style>
@@ -9128,6 +9570,7 @@
     <w:rPr>
       <w:rFonts w:ascii="Consolas" w:hAnsi="Consolas"/>
       <w:color w:val="EF2929"/>
+      <w:sz w:val="22"/>
       <w:shd w:color="auto" w:fill="F8F8F8" w:val="clear"/>
     </w:rPr>
   </w:style>
@@ -9138,6 +9581,7 @@
       <w:rFonts w:ascii="Consolas" w:hAnsi="Consolas"/>
       <w:b/>
       <w:color w:val="A40000"/>
+      <w:sz w:val="22"/>
       <w:shd w:color="auto" w:fill="F8F8F8" w:val="clear"/>
     </w:rPr>
   </w:style>
@@ -9148,6 +9592,7 @@
     <w:rPr>
       <w:rFonts w:ascii="Consolas" w:hAnsi="Consolas"/>
       <w:color w:themeColor="text1" w:themeTint="F2" w:val="0D0D0D"/>
+      <w:sz w:val="22"/>
       <w:shd w:color="auto" w:fill="F8F8F8" w:val="clear"/>
     </w:rPr>
   </w:style>

</xml_diff>